<commit_message>
Re-aprovisiona 7 nodos con IDs nuevos (solo datos en vivo), cron de desconexiones y ventana 24-27/09
Co-Authored-By: Claude Opus 5.5 <noreply@anthropic.com>
</commit_message>
<xml_diff>
--- a/Informe_Parcial1_CacaoSense.docx
+++ b/Informe_Parcial1_CacaoSense.docx
@@ -321,7 +321,7 @@
               <w:rPr>
                 <w:sz w:val="18"/>
               </w:rPr>
-              <w:t>1.0 · generado 24/09/2026 16:21 (hora Colombia)</w:t>
+              <w:t>1.0 · generado 24/09/2026 16:35 (hora Colombia)</w:t>
             </w:r>
           </w:p>
         </w:tc>
@@ -1592,7 +1592,7 @@
               <w:rPr>
                 <w:sz w:val="14"/>
               </w:rPr>
-              <w:t>cacao-03-lote3-python</w:t>
+              <w:t>cacao-03-lote3-sdk</w:t>
             </w:r>
           </w:p>
         </w:tc>
@@ -1693,7 +1693,7 @@
               <w:rPr>
                 <w:sz w:val="14"/>
               </w:rPr>
-              <w:t>cacao-04-aire-api</w:t>
+              <w:t>cacao-04-aire-cams</w:t>
             </w:r>
           </w:p>
         </w:tc>
@@ -1799,7 +1799,7 @@
               <w:rPr>
                 <w:sz w:val="14"/>
               </w:rPr>
-              <w:t>cacao-05-meteo-atlas</w:t>
+              <w:t>cacao-05-meteo-feed</w:t>
             </w:r>
           </w:p>
         </w:tc>
@@ -1900,7 +1900,7 @@
               <w:rPr>
                 <w:sz w:val="14"/>
               </w:rPr>
-              <w:t>cacao-06-fermenta-mqtt</w:t>
+              <w:t>cacao-06-ferm-paho</w:t>
             </w:r>
           </w:p>
         </w:tc>
@@ -2006,7 +2006,7 @@
               <w:rPr>
                 <w:sz w:val="14"/>
               </w:rPr>
-              <w:t>cacao-07-campo-replay</w:t>
+              <w:t>cacao-07-campo-era5</w:t>
             </w:r>
           </w:p>
         </w:tc>
@@ -2107,7 +2107,7 @@
               <w:rPr>
                 <w:sz w:val="14"/>
               </w:rPr>
-              <w:t>cacao-08-dosel-https</w:t>
+              <w:t>cacao-08-dosel-rest</w:t>
             </w:r>
           </w:p>
         </w:tc>
@@ -2314,7 +2314,7 @@
               <w:rPr>
                 <w:sz w:val="14"/>
               </w:rPr>
-              <w:t>cacao-10-bodega-node</w:t>
+              <w:t>cacao-10-bodega-mqttjs</w:t>
             </w:r>
           </w:p>
         </w:tc>
@@ -5937,7 +5937,7 @@
               <w:rPr>
                 <w:sz w:val="14"/>
               </w:rPr>
-              <w:t>03-lote3-python</w:t>
+              <w:t>03-lote3-sdk</w:t>
             </w:r>
           </w:p>
         </w:tc>
@@ -5979,7 +5979,7 @@
               <w:rPr>
                 <w:sz w:val="14"/>
               </w:rPr>
-              <w:t>23.80 (16:07)</w:t>
+              <w:t>17.30 (16:30)</w:t>
             </w:r>
           </w:p>
         </w:tc>
@@ -5993,7 +5993,7 @@
               <w:rPr>
                 <w:sz w:val="14"/>
               </w:rPr>
-              <w:t>16.70</w:t>
+              <w:t>16.40</w:t>
             </w:r>
           </w:p>
         </w:tc>
@@ -6007,7 +6007,7 @@
               <w:rPr>
                 <w:sz w:val="14"/>
               </w:rPr>
-              <w:t>19.84</w:t>
+              <w:t>16.94</w:t>
             </w:r>
           </w:p>
         </w:tc>
@@ -6021,7 +6021,7 @@
               <w:rPr>
                 <w:sz w:val="14"/>
               </w:rPr>
-              <w:t>297</w:t>
+              <w:t>14</w:t>
             </w:r>
           </w:p>
         </w:tc>
@@ -6052,7 +6052,7 @@
               <w:rPr>
                 <w:sz w:val="14"/>
               </w:rPr>
-              <w:t>03-lote3-python</w:t>
+              <w:t>03-lote3-sdk</w:t>
             </w:r>
           </w:p>
         </w:tc>
@@ -6173,7 +6173,7 @@
               <w:rPr>
                 <w:sz w:val="14"/>
               </w:rPr>
-              <w:t>03-lote3-python</w:t>
+              <w:t>03-lote3-sdk</w:t>
             </w:r>
           </w:p>
         </w:tc>
@@ -6288,7 +6288,7 @@
               <w:rPr>
                 <w:sz w:val="14"/>
               </w:rPr>
-              <w:t>03-lote3-python</w:t>
+              <w:t>03-lote3-sdk</w:t>
             </w:r>
           </w:p>
         </w:tc>
@@ -6479,7 +6479,7 @@
               <w:rPr>
                 <w:sz w:val="14"/>
               </w:rPr>
-              <w:t>28.23</w:t>
+              <w:t>29.77</w:t>
             </w:r>
           </w:p>
         </w:tc>
@@ -6493,7 +6493,7 @@
               <w:rPr>
                 <w:sz w:val="14"/>
               </w:rPr>
-              <w:t>66</w:t>
+              <w:t>81</w:t>
             </w:r>
           </w:p>
         </w:tc>
@@ -7353,7 +7353,7 @@
               <w:rPr>
                 <w:sz w:val="14"/>
               </w:rPr>
-              <w:t>05-meteo-atlas</w:t>
+              <w:t>05-meteo-feed</w:t>
             </w:r>
           </w:p>
         </w:tc>
@@ -7395,7 +7395,7 @@
               <w:rPr>
                 <w:sz w:val="14"/>
               </w:rPr>
-              <w:t>29.70 (14:44)</w:t>
+              <w:t>26.70 (16:29)</w:t>
             </w:r>
           </w:p>
         </w:tc>
@@ -7409,7 +7409,7 @@
               <w:rPr>
                 <w:sz w:val="14"/>
               </w:rPr>
-              <w:t>27.40</w:t>
+              <w:t>26.70</w:t>
             </w:r>
           </w:p>
         </w:tc>
@@ -7423,7 +7423,7 @@
               <w:rPr>
                 <w:sz w:val="14"/>
               </w:rPr>
-              <w:t>28.74</w:t>
+              <w:t>26.70</w:t>
             </w:r>
           </w:p>
         </w:tc>
@@ -7437,7 +7437,7 @@
               <w:rPr>
                 <w:sz w:val="14"/>
               </w:rPr>
-              <w:t>20</w:t>
+              <w:t>1</w:t>
             </w:r>
           </w:p>
         </w:tc>
@@ -7468,7 +7468,7 @@
               <w:rPr>
                 <w:sz w:val="14"/>
               </w:rPr>
-              <w:t>05-meteo-atlas</w:t>
+              <w:t>05-meteo-feed</w:t>
             </w:r>
           </w:p>
         </w:tc>
@@ -7589,7 +7589,7 @@
               <w:rPr>
                 <w:sz w:val="14"/>
               </w:rPr>
-              <w:t>05-meteo-atlas</w:t>
+              <w:t>05-meteo-feed</w:t>
             </w:r>
           </w:p>
         </w:tc>
@@ -7704,7 +7704,7 @@
               <w:rPr>
                 <w:sz w:val="14"/>
               </w:rPr>
-              <w:t>05-meteo-atlas</w:t>
+              <w:t>05-meteo-feed</w:t>
             </w:r>
           </w:p>
         </w:tc>
@@ -7825,7 +7825,7 @@
               <w:rPr>
                 <w:sz w:val="14"/>
               </w:rPr>
-              <w:t>05-meteo-atlas</w:t>
+              <w:t>05-meteo-feed</w:t>
             </w:r>
           </w:p>
         </w:tc>
@@ -7867,7 +7867,7 @@
               <w:rPr>
                 <w:sz w:val="14"/>
               </w:rPr>
-              <w:t>73.00 (16:04)</w:t>
+              <w:t>78.00 (16:29)</w:t>
             </w:r>
           </w:p>
         </w:tc>
@@ -7881,7 +7881,7 @@
               <w:rPr>
                 <w:sz w:val="14"/>
               </w:rPr>
-              <w:t>61.00</w:t>
+              <w:t>78.00</w:t>
             </w:r>
           </w:p>
         </w:tc>
@@ -7895,7 +7895,7 @@
               <w:rPr>
                 <w:sz w:val="14"/>
               </w:rPr>
-              <w:t>66.10</w:t>
+              <w:t>78.00</w:t>
             </w:r>
           </w:p>
         </w:tc>
@@ -7909,7 +7909,7 @@
               <w:rPr>
                 <w:sz w:val="14"/>
               </w:rPr>
-              <w:t>20</w:t>
+              <w:t>1</w:t>
             </w:r>
           </w:p>
         </w:tc>
@@ -7940,7 +7940,7 @@
               <w:rPr>
                 <w:sz w:val="14"/>
               </w:rPr>
-              <w:t>05-meteo-atlas</w:t>
+              <w:t>05-meteo-feed</w:t>
             </w:r>
           </w:p>
         </w:tc>
@@ -8061,7 +8061,7 @@
               <w:rPr>
                 <w:sz w:val="14"/>
               </w:rPr>
-              <w:t>05-meteo-atlas</w:t>
+              <w:t>05-meteo-feed</w:t>
             </w:r>
           </w:p>
         </w:tc>
@@ -8176,7 +8176,7 @@
               <w:rPr>
                 <w:sz w:val="14"/>
               </w:rPr>
-              <w:t>05-meteo-atlas</w:t>
+              <w:t>05-meteo-feed</w:t>
             </w:r>
           </w:p>
         </w:tc>
@@ -8297,7 +8297,7 @@
               <w:rPr>
                 <w:sz w:val="14"/>
               </w:rPr>
-              <w:t>05-meteo-atlas</w:t>
+              <w:t>05-meteo-feed</w:t>
             </w:r>
           </w:p>
         </w:tc>
@@ -8339,7 +8339,7 @@
               <w:rPr>
                 <w:sz w:val="14"/>
               </w:rPr>
-              <w:t>0.10 (15:49)</w:t>
+              <w:t>0.10 (16:29)</w:t>
             </w:r>
           </w:p>
         </w:tc>
@@ -8353,7 +8353,7 @@
               <w:rPr>
                 <w:sz w:val="14"/>
               </w:rPr>
-              <w:t>0.00</w:t>
+              <w:t>0.10</w:t>
             </w:r>
           </w:p>
         </w:tc>
@@ -8367,7 +8367,7 @@
               <w:rPr>
                 <w:sz w:val="14"/>
               </w:rPr>
-              <w:t>0.06</w:t>
+              <w:t>0.10</w:t>
             </w:r>
           </w:p>
         </w:tc>
@@ -8381,7 +8381,7 @@
               <w:rPr>
                 <w:sz w:val="14"/>
               </w:rPr>
-              <w:t>20</w:t>
+              <w:t>1</w:t>
             </w:r>
           </w:p>
         </w:tc>
@@ -8395,7 +8395,7 @@
               <w:rPr>
                 <w:sz w:val="14"/>
               </w:rPr>
-              <w:t>1.2</w:t>
+              <w:t>0.1</w:t>
             </w:r>
           </w:p>
         </w:tc>
@@ -8412,7 +8412,7 @@
               <w:rPr>
                 <w:sz w:val="14"/>
               </w:rPr>
-              <w:t>05-meteo-atlas</w:t>
+              <w:t>05-meteo-feed</w:t>
             </w:r>
           </w:p>
         </w:tc>
@@ -8533,7 +8533,7 @@
               <w:rPr>
                 <w:sz w:val="14"/>
               </w:rPr>
-              <w:t>05-meteo-atlas</w:t>
+              <w:t>05-meteo-feed</w:t>
             </w:r>
           </w:p>
         </w:tc>
@@ -8648,7 +8648,7 @@
               <w:rPr>
                 <w:sz w:val="14"/>
               </w:rPr>
-              <w:t>05-meteo-atlas</w:t>
+              <w:t>05-meteo-feed</w:t>
             </w:r>
           </w:p>
         </w:tc>
@@ -8769,7 +8769,7 @@
               <w:rPr>
                 <w:sz w:val="14"/>
               </w:rPr>
-              <w:t>05-meteo-atlas</w:t>
+              <w:t>05-meteo-feed</w:t>
             </w:r>
           </w:p>
         </w:tc>
@@ -8811,7 +8811,7 @@
               <w:rPr>
                 <w:sz w:val="14"/>
               </w:rPr>
-              <w:t>611.00 (14:44)</w:t>
+              <w:t>254.00 (16:29)</w:t>
             </w:r>
           </w:p>
         </w:tc>
@@ -8825,7 +8825,7 @@
               <w:rPr>
                 <w:sz w:val="14"/>
               </w:rPr>
-              <w:t>285.00</w:t>
+              <w:t>254.00</w:t>
             </w:r>
           </w:p>
         </w:tc>
@@ -8839,7 +8839,7 @@
               <w:rPr>
                 <w:sz w:val="14"/>
               </w:rPr>
-              <w:t>422.60</w:t>
+              <w:t>254.00</w:t>
             </w:r>
           </w:p>
         </w:tc>
@@ -8853,7 +8853,7 @@
               <w:rPr>
                 <w:sz w:val="14"/>
               </w:rPr>
-              <w:t>20</w:t>
+              <w:t>1</w:t>
             </w:r>
           </w:p>
         </w:tc>
@@ -8884,7 +8884,7 @@
               <w:rPr>
                 <w:sz w:val="14"/>
               </w:rPr>
-              <w:t>05-meteo-atlas</w:t>
+              <w:t>05-meteo-feed</w:t>
             </w:r>
           </w:p>
         </w:tc>
@@ -9005,7 +9005,7 @@
               <w:rPr>
                 <w:sz w:val="14"/>
               </w:rPr>
-              <w:t>05-meteo-atlas</w:t>
+              <w:t>05-meteo-feed</w:t>
             </w:r>
           </w:p>
         </w:tc>
@@ -9120,7 +9120,7 @@
               <w:rPr>
                 <w:sz w:val="14"/>
               </w:rPr>
-              <w:t>05-meteo-atlas</w:t>
+              <w:t>05-meteo-feed</w:t>
             </w:r>
           </w:p>
         </w:tc>
@@ -9241,7 +9241,7 @@
               <w:rPr>
                 <w:sz w:val="14"/>
               </w:rPr>
-              <w:t>04-aire-api</w:t>
+              <w:t>04-aire-cams</w:t>
             </w:r>
           </w:p>
         </w:tc>
@@ -9283,7 +9283,7 @@
               <w:rPr>
                 <w:sz w:val="14"/>
               </w:rPr>
-              <w:t>8.80 (16:10)</w:t>
+              <w:t>8.80 (16:29)</w:t>
             </w:r>
           </w:p>
         </w:tc>
@@ -9297,7 +9297,7 @@
               <w:rPr>
                 <w:sz w:val="14"/>
               </w:rPr>
-              <w:t>7.60</w:t>
+              <w:t>8.80</w:t>
             </w:r>
           </w:p>
         </w:tc>
@@ -9311,7 +9311,7 @@
               <w:rPr>
                 <w:sz w:val="14"/>
               </w:rPr>
-              <w:t>7.97</w:t>
+              <w:t>8.80</w:t>
             </w:r>
           </w:p>
         </w:tc>
@@ -9325,7 +9325,7 @@
               <w:rPr>
                 <w:sz w:val="14"/>
               </w:rPr>
-              <w:t>19</w:t>
+              <w:t>1</w:t>
             </w:r>
           </w:p>
         </w:tc>
@@ -9356,7 +9356,7 @@
               <w:rPr>
                 <w:sz w:val="14"/>
               </w:rPr>
-              <w:t>04-aire-api</w:t>
+              <w:t>04-aire-cams</w:t>
             </w:r>
           </w:p>
         </w:tc>
@@ -9477,7 +9477,7 @@
               <w:rPr>
                 <w:sz w:val="14"/>
               </w:rPr>
-              <w:t>04-aire-api</w:t>
+              <w:t>04-aire-cams</w:t>
             </w:r>
           </w:p>
         </w:tc>
@@ -9592,7 +9592,7 @@
               <w:rPr>
                 <w:sz w:val="14"/>
               </w:rPr>
-              <w:t>04-aire-api</w:t>
+              <w:t>04-aire-cams</w:t>
             </w:r>
           </w:p>
         </w:tc>
@@ -9713,7 +9713,7 @@
               <w:rPr>
                 <w:sz w:val="14"/>
               </w:rPr>
-              <w:t>04-aire-api</w:t>
+              <w:t>04-aire-cams</w:t>
             </w:r>
           </w:p>
         </w:tc>
@@ -9755,7 +9755,7 @@
               <w:rPr>
                 <w:sz w:val="14"/>
               </w:rPr>
-              <w:t>62.00 (16:10)</w:t>
+              <w:t>62.00 (16:29)</w:t>
             </w:r>
           </w:p>
         </w:tc>
@@ -9769,7 +9769,7 @@
               <w:rPr>
                 <w:sz w:val="14"/>
               </w:rPr>
-              <w:t>50.00</w:t>
+              <w:t>62.00</w:t>
             </w:r>
           </w:p>
         </w:tc>
@@ -9783,7 +9783,7 @@
               <w:rPr>
                 <w:sz w:val="14"/>
               </w:rPr>
-              <w:t>51.89</w:t>
+              <w:t>62.00</w:t>
             </w:r>
           </w:p>
         </w:tc>
@@ -9797,7 +9797,7 @@
               <w:rPr>
                 <w:sz w:val="14"/>
               </w:rPr>
-              <w:t>19</w:t>
+              <w:t>1</w:t>
             </w:r>
           </w:p>
         </w:tc>
@@ -9828,7 +9828,7 @@
               <w:rPr>
                 <w:sz w:val="14"/>
               </w:rPr>
-              <w:t>04-aire-api</w:t>
+              <w:t>04-aire-cams</w:t>
             </w:r>
           </w:p>
         </w:tc>
@@ -9949,7 +9949,7 @@
               <w:rPr>
                 <w:sz w:val="14"/>
               </w:rPr>
-              <w:t>04-aire-api</w:t>
+              <w:t>04-aire-cams</w:t>
             </w:r>
           </w:p>
         </w:tc>
@@ -10064,7 +10064,7 @@
               <w:rPr>
                 <w:sz w:val="14"/>
               </w:rPr>
-              <w:t>04-aire-api</w:t>
+              <w:t>04-aire-cams</w:t>
             </w:r>
           </w:p>
         </w:tc>
@@ -10185,7 +10185,7 @@
               <w:rPr>
                 <w:sz w:val="14"/>
               </w:rPr>
-              <w:t>06-fermenta-mqtt</w:t>
+              <w:t>06-ferm-paho</w:t>
             </w:r>
           </w:p>
         </w:tc>
@@ -10227,7 +10227,7 @@
               <w:rPr>
                 <w:sz w:val="14"/>
               </w:rPr>
-              <w:t>32.96 (15:57)</w:t>
+              <w:t>32.58 (16:30)</w:t>
             </w:r>
           </w:p>
         </w:tc>
@@ -10241,7 +10241,7 @@
               <w:rPr>
                 <w:sz w:val="14"/>
               </w:rPr>
-              <w:t>31.31</w:t>
+              <w:t>31.93</w:t>
             </w:r>
           </w:p>
         </w:tc>
@@ -10255,7 +10255,7 @@
               <w:rPr>
                 <w:sz w:val="14"/>
               </w:rPr>
-              <w:t>32.06</w:t>
+              <w:t>32.21</w:t>
             </w:r>
           </w:p>
         </w:tc>
@@ -10269,7 +10269,7 @@
               <w:rPr>
                 <w:sz w:val="14"/>
               </w:rPr>
-              <w:t>98</w:t>
+              <w:t>5</w:t>
             </w:r>
           </w:p>
         </w:tc>
@@ -10300,7 +10300,7 @@
               <w:rPr>
                 <w:sz w:val="14"/>
               </w:rPr>
-              <w:t>06-fermenta-mqtt</w:t>
+              <w:t>06-ferm-paho</w:t>
             </w:r>
           </w:p>
         </w:tc>
@@ -10421,7 +10421,7 @@
               <w:rPr>
                 <w:sz w:val="14"/>
               </w:rPr>
-              <w:t>06-fermenta-mqtt</w:t>
+              <w:t>06-ferm-paho</w:t>
             </w:r>
           </w:p>
         </w:tc>
@@ -10536,7 +10536,7 @@
               <w:rPr>
                 <w:sz w:val="14"/>
               </w:rPr>
-              <w:t>06-fermenta-mqtt</w:t>
+              <w:t>06-ferm-paho</w:t>
             </w:r>
           </w:p>
         </w:tc>
@@ -10657,7 +10657,7 @@
               <w:rPr>
                 <w:sz w:val="14"/>
               </w:rPr>
-              <w:t>08-dosel-https</w:t>
+              <w:t>08-dosel-rest</w:t>
             </w:r>
           </w:p>
         </w:tc>
@@ -10699,7 +10699,7 @@
               <w:rPr>
                 <w:sz w:val="14"/>
               </w:rPr>
-              <w:t>28.70 (14:52)</w:t>
+              <w:t>26.20 (16:33)</w:t>
             </w:r>
           </w:p>
         </w:tc>
@@ -10713,7 +10713,7 @@
               <w:rPr>
                 <w:sz w:val="14"/>
               </w:rPr>
-              <w:t>26.40</w:t>
+              <w:t>25.80</w:t>
             </w:r>
           </w:p>
         </w:tc>
@@ -10727,7 +10727,7 @@
               <w:rPr>
                 <w:sz w:val="14"/>
               </w:rPr>
-              <w:t>27.62</w:t>
+              <w:t>26.00</w:t>
             </w:r>
           </w:p>
         </w:tc>
@@ -10741,7 +10741,7 @@
               <w:rPr>
                 <w:sz w:val="14"/>
               </w:rPr>
-              <w:t>97</w:t>
+              <w:t>5</w:t>
             </w:r>
           </w:p>
         </w:tc>
@@ -10772,7 +10772,7 @@
               <w:rPr>
                 <w:sz w:val="14"/>
               </w:rPr>
-              <w:t>08-dosel-https</w:t>
+              <w:t>08-dosel-rest</w:t>
             </w:r>
           </w:p>
         </w:tc>
@@ -10893,7 +10893,7 @@
               <w:rPr>
                 <w:sz w:val="14"/>
               </w:rPr>
-              <w:t>08-dosel-https</w:t>
+              <w:t>08-dosel-rest</w:t>
             </w:r>
           </w:p>
         </w:tc>
@@ -11008,7 +11008,7 @@
               <w:rPr>
                 <w:sz w:val="14"/>
               </w:rPr>
-              <w:t>08-dosel-https</w:t>
+              <w:t>08-dosel-rest</w:t>
             </w:r>
           </w:p>
         </w:tc>
@@ -11136,7 +11136,7 @@
         <w:rPr>
           <w:sz w:val="20"/>
         </w:rPr>
-        <w:t>Jue 24-sep: la temperatura máxima del predio fue 29.7 °C a las 14:44 (radiación 611 W/m²), la mínima 27.4 °C de madrugada; lluvia acumulada 1.2 mm y HR máxima 73 %.</w:t>
+        <w:t>Jue 24-sep: la temperatura máxima del predio fue 26.7 °C a las 16:29 (radiación 254 W/m²), la mínima 26.7 °C de madrugada; lluvia acumulada 0.1 mm y HR máxima 78 %.</w:t>
       </w:r>
     </w:p>
     <w:p>
@@ -11147,7 +11147,7 @@
         <w:rPr>
           <w:sz w:val="20"/>
         </w:rPr>
-        <w:t>Suelo Lote 3: 57 % de las muestras quedaron por debajo del umbral académico de 20 % VWC; el mínimo (16.7 %) ocurre al final de la tarde por evapotranspiración, y el comando setIrrigation lo eleva ~6 puntos. Es la condición que dispara R1 (suelo seco).</w:t>
+        <w:t>Suelo Lote 3: 100 % de las muestras quedaron por debajo del umbral académico de 20 % VWC; el mínimo (16.4 %) ocurre al final de la tarde por evapotranspiración, y el comando setIrrigation lo eleva ~6 puntos. Es la condición que dispara R1 (suelo seco).</w:t>
       </w:r>
     </w:p>
     <w:p>
@@ -11158,7 +11158,7 @@
         <w:rPr>
           <w:sz w:val="20"/>
         </w:rPr>
-        <w:t>Fermentación: la masa pasó de 31.3 °C a 33.0 °C, coherente con el perfil ICCO/AGROSAVIA (40–50 °C tras 48–96 h); no superó el umbral R2 de 52 °C, por lo que no hubo alarma de sobrefermentación. La masa bajó de 49.5 a 49.2 kg por pérdida de exudado.</w:t>
+        <w:t>Fermentación: la masa pasó de 31.9 °C a 32.6 °C, coherente con el perfil ICCO/AGROSAVIA (40–50 °C tras 48–96 h); no superó el umbral R2 de 52 °C, por lo que no hubo alarma de sobrefermentación. La masa bajó de 49.3 a 49.2 kg por pérdida de exudado.</w:t>
       </w:r>
     </w:p>
     <w:p>
@@ -11169,7 +11169,7 @@
         <w:rPr>
           <w:sz w:val="20"/>
         </w:rPr>
-        <w:t>Aire rural: PM2.5 entre 7.6 y 8.8 µg/m³ y US AQI máximo 62 (categoría moderada); R4 (AQI &gt; 100) no se activó. Los picos coinciden con horas de baja mezcla atmosférica (madrugada).</w:t>
+        <w:t>Aire rural: PM2.5 entre 8.8 y 8.8 µg/m³ y US AQI máximo 62 (categoría moderada); R4 (AQI &gt; 100) no se activó. Los picos coinciden con horas de baja mezcla atmosférica (madrugada).</w:t>
       </w:r>
     </w:p>
     <w:p>
@@ -11693,7 +11693,7 @@
               <w:rPr>
                 <w:sz w:val="16"/>
               </w:rPr>
-              <w:t>66</w:t>
+              <w:t>81</w:t>
             </w:r>
           </w:p>
         </w:tc>
@@ -11771,7 +11771,7 @@
               <w:rPr>
                 <w:sz w:val="16"/>
               </w:rPr>
-              <w:t>03-lote3-python</w:t>
+              <w:t>03-lote3-sdk</w:t>
             </w:r>
           </w:p>
         </w:tc>
@@ -11813,7 +11813,7 @@
               <w:rPr>
                 <w:sz w:val="16"/>
               </w:rPr>
-              <w:t>297</w:t>
+              <w:t>14</w:t>
             </w:r>
           </w:p>
         </w:tc>
@@ -11830,7 +11830,7 @@
               <w:rPr>
                 <w:sz w:val="16"/>
               </w:rPr>
-              <w:t>04-aire-api</w:t>
+              <w:t>04-aire-cams</w:t>
             </w:r>
           </w:p>
         </w:tc>
@@ -11860,7 +11860,7 @@
               <w:rPr>
                 <w:sz w:val="16"/>
               </w:rPr>
-              <w:t>301 s</w:t>
+              <w:t>—</w:t>
             </w:r>
           </w:p>
         </w:tc>
@@ -11875,7 +11875,7 @@
               <w:rPr>
                 <w:sz w:val="16"/>
               </w:rPr>
-              <w:t>19</w:t>
+              <w:t>1</w:t>
             </w:r>
           </w:p>
         </w:tc>
@@ -11891,7 +11891,7 @@
               <w:rPr>
                 <w:sz w:val="16"/>
               </w:rPr>
-              <w:t>05-meteo-atlas</w:t>
+              <w:t>05-meteo-feed</w:t>
             </w:r>
           </w:p>
         </w:tc>
@@ -11919,7 +11919,7 @@
               <w:rPr>
                 <w:sz w:val="16"/>
               </w:rPr>
-              <w:t>301 s</w:t>
+              <w:t>—</w:t>
             </w:r>
           </w:p>
         </w:tc>
@@ -11933,7 +11933,7 @@
               <w:rPr>
                 <w:sz w:val="16"/>
               </w:rPr>
-              <w:t>20</w:t>
+              <w:t>1</w:t>
             </w:r>
           </w:p>
         </w:tc>
@@ -11950,7 +11950,7 @@
               <w:rPr>
                 <w:sz w:val="16"/>
               </w:rPr>
-              <w:t>06-fermenta-mqtt</w:t>
+              <w:t>06-ferm-paho</w:t>
             </w:r>
           </w:p>
         </w:tc>
@@ -11995,7 +11995,7 @@
               <w:rPr>
                 <w:sz w:val="16"/>
               </w:rPr>
-              <w:t>98</w:t>
+              <w:t>5</w:t>
             </w:r>
           </w:p>
         </w:tc>
@@ -12011,7 +12011,7 @@
               <w:rPr>
                 <w:sz w:val="16"/>
               </w:rPr>
-              <w:t>07-campo-replay</w:t>
+              <w:t>07-campo-era5</w:t>
             </w:r>
           </w:p>
         </w:tc>
@@ -12053,7 +12053,7 @@
               <w:rPr>
                 <w:sz w:val="16"/>
               </w:rPr>
-              <w:t>189</w:t>
+              <w:t>10</w:t>
             </w:r>
           </w:p>
         </w:tc>
@@ -12070,7 +12070,7 @@
               <w:rPr>
                 <w:sz w:val="16"/>
               </w:rPr>
-              <w:t>08-dosel-https</w:t>
+              <w:t>08-dosel-rest</w:t>
             </w:r>
           </w:p>
         </w:tc>
@@ -12115,7 +12115,7 @@
               <w:rPr>
                 <w:sz w:val="16"/>
               </w:rPr>
-              <w:t>97</w:t>
+              <w:t>5</w:t>
             </w:r>
           </w:p>
         </w:tc>
@@ -12190,7 +12190,7 @@
               <w:rPr>
                 <w:sz w:val="16"/>
               </w:rPr>
-              <w:t>10-bodega-node</w:t>
+              <w:t>10-bodega-mqttjs</w:t>
             </w:r>
           </w:p>
         </w:tc>
@@ -12235,7 +12235,7 @@
               <w:rPr>
                 <w:sz w:val="16"/>
               </w:rPr>
-              <w:t>291</w:t>
+              <w:t>17</w:t>
             </w:r>
           </w:p>
         </w:tc>
@@ -12362,7 +12362,7 @@
               <w:rPr>
                 <w:sz w:val="16"/>
               </w:rPr>
-              <w:t>03-lote3-python</w:t>
+              <w:t>—</w:t>
             </w:r>
           </w:p>
         </w:tc>
@@ -12376,7 +12376,7 @@
               <w:rPr>
                 <w:sz w:val="16"/>
               </w:rPr>
-              <w:t>Jue 24-sep</w:t>
+              <w:t>—</w:t>
             </w:r>
           </w:p>
         </w:tc>
@@ -12390,7 +12390,7 @@
               <w:rPr>
                 <w:sz w:val="16"/>
               </w:rPr>
-              <w:t>14:30</w:t>
+              <w:t>—</w:t>
             </w:r>
           </w:p>
         </w:tc>
@@ -12404,7 +12404,7 @@
               <w:rPr>
                 <w:sz w:val="16"/>
               </w:rPr>
-              <w:t>14:39</w:t>
+              <w:t>—</w:t>
             </w:r>
           </w:p>
         </w:tc>
@@ -12418,305 +12418,7 @@
               <w:rPr>
                 <w:sz w:val="16"/>
               </w:rPr>
-              <w:t>9 min</w:t>
-            </w:r>
-          </w:p>
-        </w:tc>
-      </w:tr>
-      <w:tr>
-        <w:tc>
-          <w:tcPr>
-            <w:tcW w:type="dxa" w:w="2835"/>
-            <w:shd w:val="clear" w:color="auto" w:fill="F7EFE6"/>
-          </w:tcPr>
-          <w:p>
-            <w:r/>
-            <w:r>
-              <w:rPr>
-                <w:sz w:val="16"/>
-              </w:rPr>
-              <w:t>03-lote3-python</w:t>
-            </w:r>
-          </w:p>
-        </w:tc>
-        <w:tc>
-          <w:tcPr>
-            <w:tcW w:type="dxa" w:w="1701"/>
-            <w:shd w:val="clear" w:color="auto" w:fill="F7EFE6"/>
-          </w:tcPr>
-          <w:p>
-            <w:r/>
-            <w:r>
-              <w:rPr>
-                <w:sz w:val="16"/>
-              </w:rPr>
-              <w:t>Jue 24-sep</w:t>
-            </w:r>
-          </w:p>
-        </w:tc>
-        <w:tc>
-          <w:tcPr>
-            <w:tcW w:type="dxa" w:w="1417"/>
-            <w:shd w:val="clear" w:color="auto" w:fill="F7EFE6"/>
-          </w:tcPr>
-          <w:p>
-            <w:r/>
-            <w:r>
-              <w:rPr>
-                <w:sz w:val="16"/>
-              </w:rPr>
-              <w:t>14:42</w:t>
-            </w:r>
-          </w:p>
-        </w:tc>
-        <w:tc>
-          <w:tcPr>
-            <w:tcW w:type="dxa" w:w="1417"/>
-            <w:shd w:val="clear" w:color="auto" w:fill="F7EFE6"/>
-          </w:tcPr>
-          <w:p>
-            <w:r/>
-            <w:r>
-              <w:rPr>
-                <w:sz w:val="16"/>
-              </w:rPr>
-              <w:t>14:52</w:t>
-            </w:r>
-          </w:p>
-        </w:tc>
-        <w:tc>
-          <w:tcPr>
-            <w:tcW w:type="dxa" w:w="1417"/>
-            <w:shd w:val="clear" w:color="auto" w:fill="F7EFE6"/>
-          </w:tcPr>
-          <w:p>
-            <w:r/>
-            <w:r>
-              <w:rPr>
-                <w:sz w:val="16"/>
-              </w:rPr>
-              <w:t>10 min</w:t>
-            </w:r>
-          </w:p>
-        </w:tc>
-      </w:tr>
-      <w:tr>
-        <w:tc>
-          <w:tcPr>
-            <w:tcW w:type="dxa" w:w="2835"/>
-          </w:tcPr>
-          <w:p>
-            <w:r/>
-            <w:r>
-              <w:rPr>
-                <w:sz w:val="16"/>
-              </w:rPr>
-              <w:t>06-fermenta-mqtt</w:t>
-            </w:r>
-          </w:p>
-        </w:tc>
-        <w:tc>
-          <w:tcPr>
-            <w:tcW w:type="dxa" w:w="1701"/>
-          </w:tcPr>
-          <w:p>
-            <w:r/>
-            <w:r>
-              <w:rPr>
-                <w:sz w:val="16"/>
-              </w:rPr>
-              <w:t>Jue 24-sep</w:t>
-            </w:r>
-          </w:p>
-        </w:tc>
-        <w:tc>
-          <w:tcPr>
-            <w:tcW w:type="dxa" w:w="1417"/>
-          </w:tcPr>
-          <w:p>
-            <w:r/>
-            <w:r>
-              <w:rPr>
-                <w:sz w:val="16"/>
-              </w:rPr>
-              <w:t>14:30</w:t>
-            </w:r>
-          </w:p>
-        </w:tc>
-        <w:tc>
-          <w:tcPr>
-            <w:tcW w:type="dxa" w:w="1417"/>
-          </w:tcPr>
-          <w:p>
-            <w:r/>
-            <w:r>
-              <w:rPr>
-                <w:sz w:val="16"/>
-              </w:rPr>
-              <w:t>14:39</w:t>
-            </w:r>
-          </w:p>
-        </w:tc>
-        <w:tc>
-          <w:tcPr>
-            <w:tcW w:type="dxa" w:w="1417"/>
-          </w:tcPr>
-          <w:p>
-            <w:r/>
-            <w:r>
-              <w:rPr>
-                <w:sz w:val="16"/>
-              </w:rPr>
-              <w:t>9 min</w:t>
-            </w:r>
-          </w:p>
-        </w:tc>
-      </w:tr>
-      <w:tr>
-        <w:tc>
-          <w:tcPr>
-            <w:tcW w:type="dxa" w:w="2835"/>
-            <w:shd w:val="clear" w:color="auto" w:fill="F7EFE6"/>
-          </w:tcPr>
-          <w:p>
-            <w:r/>
-            <w:r>
-              <w:rPr>
-                <w:sz w:val="16"/>
-              </w:rPr>
-              <w:t>08-dosel-https</w:t>
-            </w:r>
-          </w:p>
-        </w:tc>
-        <w:tc>
-          <w:tcPr>
-            <w:tcW w:type="dxa" w:w="1701"/>
-            <w:shd w:val="clear" w:color="auto" w:fill="F7EFE6"/>
-          </w:tcPr>
-          <w:p>
-            <w:r/>
-            <w:r>
-              <w:rPr>
-                <w:sz w:val="16"/>
-              </w:rPr>
-              <w:t>Jue 24-sep</w:t>
-            </w:r>
-          </w:p>
-        </w:tc>
-        <w:tc>
-          <w:tcPr>
-            <w:tcW w:type="dxa" w:w="1417"/>
-            <w:shd w:val="clear" w:color="auto" w:fill="F7EFE6"/>
-          </w:tcPr>
-          <w:p>
-            <w:r/>
-            <w:r>
-              <w:rPr>
-                <w:sz w:val="16"/>
-              </w:rPr>
-              <w:t>14:31</w:t>
-            </w:r>
-          </w:p>
-        </w:tc>
-        <w:tc>
-          <w:tcPr>
-            <w:tcW w:type="dxa" w:w="1417"/>
-            <w:shd w:val="clear" w:color="auto" w:fill="F7EFE6"/>
-          </w:tcPr>
-          <w:p>
-            <w:r/>
-            <w:r>
-              <w:rPr>
-                <w:sz w:val="16"/>
-              </w:rPr>
-              <w:t>14:41</w:t>
-            </w:r>
-          </w:p>
-        </w:tc>
-        <w:tc>
-          <w:tcPr>
-            <w:tcW w:type="dxa" w:w="1417"/>
-            <w:shd w:val="clear" w:color="auto" w:fill="F7EFE6"/>
-          </w:tcPr>
-          <w:p>
-            <w:r/>
-            <w:r>
-              <w:rPr>
-                <w:sz w:val="16"/>
-              </w:rPr>
-              <w:t>10 min</w:t>
-            </w:r>
-          </w:p>
-        </w:tc>
-      </w:tr>
-      <w:tr>
-        <w:tc>
-          <w:tcPr>
-            <w:tcW w:type="dxa" w:w="2835"/>
-          </w:tcPr>
-          <w:p>
-            <w:r/>
-            <w:r>
-              <w:rPr>
-                <w:sz w:val="16"/>
-              </w:rPr>
-              <w:t>10-bodega-node</w:t>
-            </w:r>
-          </w:p>
-        </w:tc>
-        <w:tc>
-          <w:tcPr>
-            <w:tcW w:type="dxa" w:w="1701"/>
-          </w:tcPr>
-          <w:p>
-            <w:r/>
-            <w:r>
-              <w:rPr>
-                <w:sz w:val="16"/>
-              </w:rPr>
-              <w:t>Jue 24-sep</w:t>
-            </w:r>
-          </w:p>
-        </w:tc>
-        <w:tc>
-          <w:tcPr>
-            <w:tcW w:type="dxa" w:w="1417"/>
-          </w:tcPr>
-          <w:p>
-            <w:r/>
-            <w:r>
-              <w:rPr>
-                <w:sz w:val="16"/>
-              </w:rPr>
-              <w:t>14:31</w:t>
-            </w:r>
-          </w:p>
-        </w:tc>
-        <w:tc>
-          <w:tcPr>
-            <w:tcW w:type="dxa" w:w="1417"/>
-          </w:tcPr>
-          <w:p>
-            <w:r/>
-            <w:r>
-              <w:rPr>
-                <w:sz w:val="16"/>
-              </w:rPr>
-              <w:t>14:41</w:t>
-            </w:r>
-          </w:p>
-        </w:tc>
-        <w:tc>
-          <w:tcPr>
-            <w:tcW w:type="dxa" w:w="1417"/>
-          </w:tcPr>
-          <w:p>
-            <w:r/>
-            <w:r>
-              <w:rPr>
-                <w:sz w:val="16"/>
-              </w:rPr>
-              <w:t>10 min</w:t>
+              <w:t>—</w:t>
             </w:r>
           </w:p>
         </w:tc>
@@ -12729,7 +12431,7 @@
           <w:b w:val="0"/>
           <w:sz w:val="18"/>
         </w:rPr>
-        <w:t>Desconexiones programadas en la VM (cron, hora local): nodo 06 02:00–02:30, nodo 10 03:00–03:10, nodo 08 12:00–12:20 (corte de enlace simulado) y nodo 03 16:00–16:15. Además hay una desconexión controlada del nodo 03 el 24/09 de 14:42 a 14:52 y los huecos propios de los nodos Wokwi (solo transmiten mientras la simulación está abierta).</w:t>
+        <w:t>Desconexiones programadas en la VM (cron, hora local): nodo 06 02:00–02:30, nodo 10 03:00–03:10, nodo 08 12:00–12:20 (corte de enlace simulado) y nodo 03 16:00–16:15. Los nodos Wokwi presentan además huecos propios: solo transmiten mientras la simulación está abierta, y la sustentación reproduce una desconexión y reconexión en vivo.</w:t>
       </w:r>
     </w:p>
     <w:p>
@@ -12777,6 +12479,24 @@
         <w:t>2026-09-24 20:50:27 [cacao-03-lote3-python] [HUB] estado de conexion: DISCONNECTED</w:t>
         <w:br/>
         <w:t>2026-09-24 20:50:27 [cacao-03-lote3-python] [HUB] estado de conexion: CONNECTED</w:t>
+        <w:br/>
+        <w:t>2026-09-24 21:25:45 [cacao-03-lote3-python] [FIN] desconexion controlada</w:t>
+        <w:br/>
+        <w:t>2026-09-24 21:25:45 [cacao-03-lote3-python] [HUB] estado de conexion: DISCONNECTED</w:t>
+        <w:br/>
+        <w:t>2026-09-24 21:25:45 [cacao-06-fermenta-mqtt] [FIN] DISCONNECT controlado</w:t>
+        <w:br/>
+        <w:t>2026-09-24 21:25:45 [cacao-10-bodega-node] [FIN] DISCONNECT controlado</w:t>
+        <w:br/>
+        <w:t>2026-09-24 21:25:46 [cacao-06-fermenta-mqtt] [HUB] DISCONNECTED rc=0; paho reintenta con backoff</w:t>
+        <w:br/>
+        <w:t>2026-09-24 21:29:56 [cacao-06-ferm-paho] [HUB] CONNACK rc=0 (CONNECTED) iotc-a4831435-0aa5-48aa-9e9d-3afd0ca35c9b.azure-devices.net:8883</w:t>
+        <w:br/>
+        <w:t>2026-09-24 21:29:56 [cacao-03-lote3-sdk] [HUB] estado de conexion: CONNECTED</w:t>
+        <w:br/>
+        <w:t>2026-09-24 21:29:56 [cacao-10-bodega-mqttjs] [HUB] CONNECTED iotc-a4831435-0aa5-48aa-9e9d-3afd0ca35c9b.azure-devices.net:8883</w:t>
+        <w:br/>
+        <w:t>2026-09-24 21:29:56 [cacao-03-lote3-sdk] [HUB] CONNECTED a iotc-a4831435-0aa5-48aa-9e9d-3afd0ca35c9b.azure-devices.net:8883 como 'cacao-03-lote3-sdk'</w:t>
       </w:r>
     </w:p>
     <w:p>
@@ -13550,7 +13270,7 @@
         <w:rPr>
           <w:sz w:val="20"/>
         </w:rPr>
-        <w:t>Equipo A (portátil): detener el servicio del nodo 03 en la VM (sudo systemctl stop cacao-03) y ejecutar python senders/sdk_device.py cacao-03-lote3-python; en IoT Central se ve Connecting → Connected → telemetría cada 15 s.</w:t>
+        <w:t>Equipo A (portátil): detener el servicio del nodo 03 en la VM (sudo systemctl stop cacao-03) y ejecutar python senders/sdk_device.py cacao-03-lote3-sdk; en IoT Central se ve Connecting → Connected → telemetría cada 15 s.</w:t>
       </w:r>
     </w:p>
     <w:p>
@@ -13668,7 +13388,7 @@
         <w:rPr>
           <w:sz w:val="20"/>
         </w:rPr>
-        <w:t>Nota de transparencia: el 24/09 se probó la carga diferida (store-and-forward, propiedad iothub-creation-time-utc) con fechas 18, 20 y 22/09. Esos datos de prueba permanecen en la aplicación, pero NO se usan en este documento: la ventana analizada son solo los 4 días con datos recibidos en vivo.</w:t>
+        <w:t>Nota de transparencia: el 24/09 se probó la carga diferida (store-and-forward, propiedad iothub-creation-time-utc) con fechas 18, 20 y 22/09; esos 7 dispositivos de prueba se eliminaron y la flota se re-aprovisionó con IDs nuevos, de modo que la ventana analizada contiene solo datos recibidos en vivo. Los nodos 01 (Digital Twin) y los modelos de farm.py son simulados, como admite el enunciado; los nodos 04, 05 y 07 usan fuentes públicas reales (Open-Meteo, CAMS, ERA5).</w:t>
       </w:r>
     </w:p>
     <w:p>

</xml_diff>

<commit_message>
Evidencias Wokwi (conexion y comandos setAlertLed/setPump) e informe regenerado
Co-Authored-By: Claude Opus 5.5 <noreply@anthropic.com>
</commit_message>
<xml_diff>
--- a/Informe_Parcial1_CacaoSense.docx
+++ b/Informe_Parcial1_CacaoSense.docx
@@ -321,7 +321,7 @@
               <w:rPr>
                 <w:sz w:val="18"/>
               </w:rPr>
-              <w:t>1.0 · generado 24/09/2026 16:35 (hora Colombia)</w:t>
+              <w:t>1.0 · generado 24/09/2026 19:05 (hora Colombia)</w:t>
             </w:r>
           </w:p>
         </w:tc>
@@ -12497,6 +12497,14 @@
         <w:t>2026-09-24 21:29:56 [cacao-10-bodega-mqttjs] [HUB] CONNECTED iotc-a4831435-0aa5-48aa-9e9d-3afd0ca35c9b.azure-devices.net:8883</w:t>
         <w:br/>
         <w:t>2026-09-24 21:29:56 [cacao-03-lote3-sdk] [HUB] CONNECTED a iotc-a4831435-0aa5-48aa-9e9d-3afd0ca35c9b.azure-devices.net:8883 como 'cacao-03-lote3-sdk'</w:t>
+        <w:br/>
+        <w:t>2026-09-24 22:27:56 [cacao-03-lote3-sdk] [HUB] estado de conexion: DISCONNECTED</w:t>
+        <w:br/>
+        <w:t>2026-09-24 22:27:56 [cacao-03-lote3-sdk] [HUB] estado de conexion: CONNECTED</w:t>
+        <w:br/>
+        <w:t>2026-09-24 23:25:56 [cacao-03-lote3-sdk] [HUB] estado de conexion: DISCONNECTED</w:t>
+        <w:br/>
+        <w:t>2026-09-24 23:25:56 [cacao-03-lote3-sdk] [HUB] estado de conexion: CONNECTED</w:t>
       </w:r>
     </w:p>
     <w:p>
@@ -13315,6 +13323,110 @@
           <w:sz w:val="20"/>
         </w:rPr>
         <w:t>El resto de la flota queda en segundo plano en la VM (servicios systemd) y con historial en los 4 días.</w:t>
+      </w:r>
+    </w:p>
+    <w:p>
+      <w:pPr>
+        <w:jc w:val="center"/>
+      </w:pPr>
+      <w:r>
+        <w:drawing>
+          <wp:inline xmlns:a="http://schemas.openxmlformats.org/drawingml/2006/main" xmlns:pic="http://schemas.openxmlformats.org/drawingml/2006/picture">
+            <wp:extent cx="4320000" cy="4549500"/>
+            <wp:docPr id="17" name="Picture 17"/>
+            <wp:cNvGraphicFramePr>
+              <a:graphicFrameLocks noChangeAspect="1"/>
+            </wp:cNvGraphicFramePr>
+            <a:graphic>
+              <a:graphicData uri="http://schemas.openxmlformats.org/drawingml/2006/picture">
+                <pic:pic>
+                  <pic:nvPicPr>
+                    <pic:cNvPr id="0" name="10-wokwi-lote2.png"/>
+                    <pic:cNvPicPr/>
+                  </pic:nvPicPr>
+                  <pic:blipFill>
+                    <a:blip r:embed="rId27"/>
+                    <a:stretch>
+                      <a:fillRect/>
+                    </a:stretch>
+                  </pic:blipFill>
+                  <pic:spPr>
+                    <a:xfrm>
+                      <a:off x="0" y="0"/>
+                      <a:ext cx="4320000" cy="4549500"/>
+                    </a:xfrm>
+                    <a:prstGeom prst="rect"/>
+                  </pic:spPr>
+                </pic:pic>
+              </a:graphicData>
+            </a:graphic>
+          </wp:inline>
+        </w:drawing>
+      </w:r>
+    </w:p>
+    <w:p>
+      <w:pPr>
+        <w:jc w:val="center"/>
+      </w:pPr>
+      <w:r>
+        <w:rPr>
+          <w:i/>
+          <w:color w:val="555555"/>
+          <w:sz w:val="17"/>
+        </w:rPr>
+        <w:t>Figura. Wokwi ESP32 #1 (Lote 2): monitor serie con DPS → IoT Hub → publish.</w:t>
+      </w:r>
+    </w:p>
+    <w:p>
+      <w:pPr>
+        <w:jc w:val="center"/>
+      </w:pPr>
+      <w:r>
+        <w:drawing>
+          <wp:inline xmlns:a="http://schemas.openxmlformats.org/drawingml/2006/main" xmlns:pic="http://schemas.openxmlformats.org/drawingml/2006/picture">
+            <wp:extent cx="4320000" cy="4549500"/>
+            <wp:docPr id="18" name="Picture 18"/>
+            <wp:cNvGraphicFramePr>
+              <a:graphicFrameLocks noChangeAspect="1"/>
+            </wp:cNvGraphicFramePr>
+            <a:graphic>
+              <a:graphicData uri="http://schemas.openxmlformats.org/drawingml/2006/picture">
+                <pic:pic>
+                  <pic:nvPicPr>
+                    <pic:cNvPr id="0" name="11-wokwi-riego.png"/>
+                    <pic:cNvPicPr/>
+                  </pic:nvPicPr>
+                  <pic:blipFill>
+                    <a:blip r:embed="rId28"/>
+                    <a:stretch>
+                      <a:fillRect/>
+                    </a:stretch>
+                  </pic:blipFill>
+                  <pic:spPr>
+                    <a:xfrm>
+                      <a:off x="0" y="0"/>
+                      <a:ext cx="4320000" cy="4549500"/>
+                    </a:xfrm>
+                    <a:prstGeom prst="rect"/>
+                  </pic:spPr>
+                </pic:pic>
+              </a:graphicData>
+            </a:graphic>
+          </wp:inline>
+        </w:drawing>
+      </w:r>
+    </w:p>
+    <w:p>
+      <w:pPr>
+        <w:jc w:val="center"/>
+      </w:pPr>
+      <w:r>
+        <w:rPr>
+          <w:i/>
+          <w:color w:val="555555"/>
+          <w:sz w:val="17"/>
+        </w:rPr>
+        <w:t>Figura. Wokwi ESP32 #2 (Reservorio): monitor serie y respuesta al comando setPump.</w:t>
       </w:r>
     </w:p>
     <w:p>

</xml_diff>

<commit_message>
Revision final: alertas disparadas en la ventana, Data Explorer, desconexion controlada del nodo 09, capturas nuevas del cuarto de control y diagrama sin R5
Co-Authored-By: Claude Opus 5.5 <noreply@anthropic.com>
</commit_message>
<xml_diff>
--- a/Informe_Parcial1_CacaoSense.docx
+++ b/Informe_Parcial1_CacaoSense.docx
@@ -321,7 +321,7 @@
               <w:rPr>
                 <w:sz w:val="18"/>
               </w:rPr>
-              <w:t>1.0 · generado 28/09/2026 22:42 (hora Colombia)</w:t>
+              <w:t>1.0 · generado 28/09/2026 23:37 (hora Colombia)</w:t>
             </w:r>
           </w:p>
         </w:tc>
@@ -6425,7 +6425,7 @@
               <w:rPr>
                 <w:sz w:val="14"/>
               </w:rPr>
-              <w:t>19.27</w:t>
+              <w:t>19.18</w:t>
             </w:r>
           </w:p>
         </w:tc>
@@ -6440,7 +6440,7 @@
               <w:rPr>
                 <w:sz w:val="14"/>
               </w:rPr>
-              <w:t>3268</w:t>
+              <w:t>3491</w:t>
             </w:r>
           </w:p>
         </w:tc>
@@ -6912,7 +6912,7 @@
               <w:rPr>
                 <w:sz w:val="14"/>
               </w:rPr>
-              <w:t>1092</w:t>
+              <w:t>1137</w:t>
             </w:r>
           </w:p>
         </w:tc>
@@ -7384,7 +7384,7 @@
               <w:rPr>
                 <w:sz w:val="14"/>
               </w:rPr>
-              <w:t>1266</w:t>
+              <w:t>1318</w:t>
             </w:r>
           </w:p>
         </w:tc>
@@ -7841,7 +7841,7 @@
               <w:rPr>
                 <w:sz w:val="14"/>
               </w:rPr>
-              <w:t>24.43</w:t>
+              <w:t>24.33</w:t>
             </w:r>
           </w:p>
         </w:tc>
@@ -7856,7 +7856,7 @@
               <w:rPr>
                 <w:sz w:val="14"/>
               </w:rPr>
-              <w:t>168</w:t>
+              <w:t>180</w:t>
             </w:r>
           </w:p>
         </w:tc>
@@ -8313,7 +8313,7 @@
               <w:rPr>
                 <w:sz w:val="14"/>
               </w:rPr>
-              <w:t>81.18</w:t>
+              <w:t>81.24</w:t>
             </w:r>
           </w:p>
         </w:tc>
@@ -8328,7 +8328,7 @@
               <w:rPr>
                 <w:sz w:val="14"/>
               </w:rPr>
-              <w:t>168</w:t>
+              <w:t>180</w:t>
             </w:r>
           </w:p>
         </w:tc>
@@ -8785,7 +8785,7 @@
               <w:rPr>
                 <w:sz w:val="14"/>
               </w:rPr>
-              <w:t>0.03</w:t>
+              <w:t>0.02</w:t>
             </w:r>
           </w:p>
         </w:tc>
@@ -8800,7 +8800,7 @@
               <w:rPr>
                 <w:sz w:val="14"/>
               </w:rPr>
-              <w:t>168</w:t>
+              <w:t>180</w:t>
             </w:r>
           </w:p>
         </w:tc>
@@ -9257,7 +9257,7 @@
               <w:rPr>
                 <w:sz w:val="14"/>
               </w:rPr>
-              <w:t>190.11</w:t>
+              <w:t>177.43</w:t>
             </w:r>
           </w:p>
         </w:tc>
@@ -9272,7 +9272,7 @@
               <w:rPr>
                 <w:sz w:val="14"/>
               </w:rPr>
-              <w:t>168</w:t>
+              <w:t>180</w:t>
             </w:r>
           </w:p>
         </w:tc>
@@ -9699,7 +9699,7 @@
               <w:rPr>
                 <w:sz w:val="14"/>
               </w:rPr>
-              <w:t>22.90 (22:31)</w:t>
+              <w:t>25.30 (23:16)</w:t>
             </w:r>
           </w:p>
         </w:tc>
@@ -9729,7 +9729,7 @@
               <w:rPr>
                 <w:sz w:val="14"/>
               </w:rPr>
-              <w:t>12.51</w:t>
+              <w:t>13.24</w:t>
             </w:r>
           </w:p>
         </w:tc>
@@ -9744,7 +9744,7 @@
               <w:rPr>
                 <w:sz w:val="14"/>
               </w:rPr>
-              <w:t>168</w:t>
+              <w:t>179</w:t>
             </w:r>
           </w:p>
         </w:tc>
@@ -10201,7 +10201,7 @@
               <w:rPr>
                 <w:sz w:val="14"/>
               </w:rPr>
-              <w:t>56.42</w:t>
+              <w:t>56.21</w:t>
             </w:r>
           </w:p>
         </w:tc>
@@ -10216,7 +10216,7 @@
               <w:rPr>
                 <w:sz w:val="14"/>
               </w:rPr>
-              <w:t>168</w:t>
+              <w:t>179</w:t>
             </w:r>
           </w:p>
         </w:tc>
@@ -10658,7 +10658,7 @@
               <w:rPr>
                 <w:sz w:val="14"/>
               </w:rPr>
-              <w:t>44.96</w:t>
+              <w:t>44.59</w:t>
             </w:r>
           </w:p>
         </w:tc>
@@ -10673,7 +10673,7 @@
               <w:rPr>
                 <w:sz w:val="14"/>
               </w:rPr>
-              <w:t>48.58</w:t>
+              <w:t>48.36</w:t>
             </w:r>
           </w:p>
         </w:tc>
@@ -10688,7 +10688,7 @@
               <w:rPr>
                 <w:sz w:val="14"/>
               </w:rPr>
-              <w:t>842</w:t>
+              <w:t>899</w:t>
             </w:r>
           </w:p>
         </w:tc>
@@ -11160,7 +11160,7 @@
               <w:rPr>
                 <w:sz w:val="14"/>
               </w:rPr>
-              <w:t>606</w:t>
+              <w:t>632</w:t>
             </w:r>
           </w:p>
         </w:tc>
@@ -11617,7 +11617,7 @@
               <w:rPr>
                 <w:sz w:val="14"/>
               </w:rPr>
-              <w:t>23.69</w:t>
+              <w:t>23.63</w:t>
             </w:r>
           </w:p>
         </w:tc>
@@ -11632,7 +11632,7 @@
               <w:rPr>
                 <w:sz w:val="14"/>
               </w:rPr>
-              <w:t>813</w:t>
+              <w:t>869</w:t>
             </w:r>
           </w:p>
         </w:tc>
@@ -11714,7 +11714,7 @@
         <w:rPr>
           <w:sz w:val="20"/>
         </w:rPr>
-        <w:t>Suelo Lote 3: 75 % de las muestras quedaron por debajo del umbral académico de 20 % VWC; el mínimo (13.3 %) ocurre al final de la tarde por evapotranspiración, y el comando setIrrigation lo eleva ~6 puntos. Es la condición que dispara R1 (suelo seco).</w:t>
+        <w:t>Suelo Lote 3: 76 % de las muestras quedaron por debajo del umbral académico de 20 % VWC; el mínimo (13.3 %) ocurre al final de la tarde por evapotranspiración, y el comando setIrrigation lo eleva ~6 puntos. Es la condición que dispara R1 (suelo seco).</w:t>
       </w:r>
     </w:p>
     <w:p>
@@ -11725,7 +11725,7 @@
         <w:rPr>
           <w:sz w:val="20"/>
         </w:rPr>
-        <w:t>Fermentación: la masa pasó de 31.9 °C a 51.0 °C, coherente con el perfil ICCO/AGROSAVIA (40–50 °C tras 48–96 h); no superó el umbral R2 de 52 °C, por lo que no hubo alarma de sobrefermentación. La masa bajó de 48.6 a 40.0 kg por pérdida de exudado.</w:t>
+        <w:t>Fermentación: la masa pasó de 31.9 °C a 51.0 °C, coherente con el perfil ICCO/AGROSAVIA (40–50 °C tras 48–96 h); no superó el umbral R2 de 52 °C, por lo que no hubo alarma de sobrefermentación. La masa bajó de 48.6 a 39.9 kg por pérdida de exudado.</w:t>
       </w:r>
     </w:p>
     <w:p>
@@ -12052,6 +12052,58 @@
       </w:r>
     </w:p>
     <w:p>
+      <w:pPr>
+        <w:jc w:val="center"/>
+      </w:pPr>
+      <w:r>
+        <w:drawing>
+          <wp:inline xmlns:a="http://schemas.openxmlformats.org/drawingml/2006/main" xmlns:pic="http://schemas.openxmlformats.org/drawingml/2006/picture">
+            <wp:extent cx="5940000" cy="2925914"/>
+            <wp:docPr id="11" name="Picture 11"/>
+            <wp:cNvGraphicFramePr>
+              <a:graphicFrameLocks noChangeAspect="1"/>
+            </wp:cNvGraphicFramePr>
+            <a:graphic>
+              <a:graphicData uri="http://schemas.openxmlformats.org/drawingml/2006/picture">
+                <pic:pic>
+                  <pic:nvPicPr>
+                    <pic:cNvPr id="0" name="13-data-explorer.png"/>
+                    <pic:cNvPicPr/>
+                  </pic:nvPicPr>
+                  <pic:blipFill>
+                    <a:blip r:embed="rId21"/>
+                    <a:stretch>
+                      <a:fillRect/>
+                    </a:stretch>
+                  </pic:blipFill>
+                  <pic:spPr>
+                    <a:xfrm>
+                      <a:off x="0" y="0"/>
+                      <a:ext cx="5940000" cy="2925914"/>
+                    </a:xfrm>
+                    <a:prstGeom prst="rect"/>
+                  </pic:spPr>
+                </pic:pic>
+              </a:graphicData>
+            </a:graphic>
+          </wp:inline>
+        </w:drawing>
+      </w:r>
+    </w:p>
+    <w:p>
+      <w:pPr>
+        <w:jc w:val="center"/>
+      </w:pPr>
+      <w:r>
+        <w:rPr>
+          <w:i/>
+          <w:color w:val="555555"/>
+          <w:sz w:val="17"/>
+        </w:rPr>
+        <w:t>Figura 10. Data Explorer de IoT Central.</w:t>
+      </w:r>
+    </w:p>
+    <w:p>
       <w:r>
         <w:br w:type="page"/>
       </w:r>
@@ -12072,7 +12124,7 @@
         <w:drawing>
           <wp:inline xmlns:a="http://schemas.openxmlformats.org/drawingml/2006/main" xmlns:pic="http://schemas.openxmlformats.org/drawingml/2006/picture">
             <wp:extent cx="5940000" cy="1821600"/>
-            <wp:docPr id="11" name="Picture 11"/>
+            <wp:docPr id="12" name="Picture 12"/>
             <wp:cNvGraphicFramePr>
               <a:graphicFrameLocks noChangeAspect="1"/>
             </wp:cNvGraphicFramePr>
@@ -12084,7 +12136,7 @@
                     <pic:cNvPicPr/>
                   </pic:nvPicPr>
                   <pic:blipFill>
-                    <a:blip r:embed="rId21"/>
+                    <a:blip r:embed="rId22"/>
                     <a:stretch>
                       <a:fillRect/>
                     </a:stretch>
@@ -12260,7 +12312,7 @@
               <w:rPr>
                 <w:sz w:val="16"/>
               </w:rPr>
-              <w:t>3950</w:t>
+              <w:t>3995</w:t>
             </w:r>
           </w:p>
         </w:tc>
@@ -12322,7 +12374,7 @@
               <w:rPr>
                 <w:sz w:val="16"/>
               </w:rPr>
-              <w:t>2872</w:t>
+              <w:t>2924</w:t>
             </w:r>
           </w:p>
         </w:tc>
@@ -12380,7 +12432,7 @@
               <w:rPr>
                 <w:sz w:val="16"/>
               </w:rPr>
-              <w:t>14574</w:t>
+              <w:t>14797</w:t>
             </w:r>
           </w:p>
         </w:tc>
@@ -12442,7 +12494,7 @@
               <w:rPr>
                 <w:sz w:val="16"/>
               </w:rPr>
-              <w:t>743</w:t>
+              <w:t>754</w:t>
             </w:r>
           </w:p>
         </w:tc>
@@ -12500,7 +12552,7 @@
               <w:rPr>
                 <w:sz w:val="16"/>
               </w:rPr>
-              <w:t>742</w:t>
+              <w:t>754</w:t>
             </w:r>
           </w:p>
         </w:tc>
@@ -12562,7 +12614,7 @@
               <w:rPr>
                 <w:sz w:val="16"/>
               </w:rPr>
-              <w:t>3659</w:t>
+              <w:t>3716</w:t>
             </w:r>
           </w:p>
         </w:tc>
@@ -12620,7 +12672,7 @@
               <w:rPr>
                 <w:sz w:val="16"/>
               </w:rPr>
-              <w:t>7438</w:t>
+              <w:t>7551</w:t>
             </w:r>
           </w:p>
         </w:tc>
@@ -12682,7 +12734,7 @@
               <w:rPr>
                 <w:sz w:val="16"/>
               </w:rPr>
-              <w:t>3647</w:t>
+              <w:t>3703</w:t>
             </w:r>
           </w:p>
         </w:tc>
@@ -12740,7 +12792,7 @@
               <w:rPr>
                 <w:sz w:val="16"/>
               </w:rPr>
-              <w:t>1303</w:t>
+              <w:t>1329</w:t>
             </w:r>
           </w:p>
         </w:tc>
@@ -12802,7 +12854,7 @@
               <w:rPr>
                 <w:sz w:val="16"/>
               </w:rPr>
-              <w:t>11123</w:t>
+              <w:t>11294</w:t>
             </w:r>
           </w:p>
         </w:tc>
@@ -13823,7 +13875,7 @@
               <w:rPr>
                 <w:sz w:val="16"/>
               </w:rPr>
-              <w:t>03-lote3-sdk</w:t>
+              <w:t>02-lote2-wokwi</w:t>
             </w:r>
           </w:p>
         </w:tc>
@@ -13837,7 +13889,7 @@
               <w:rPr>
                 <w:sz w:val="16"/>
               </w:rPr>
-              <w:t>Vie 25-sep</w:t>
+              <w:t>Lun 28-sep</w:t>
             </w:r>
           </w:p>
         </w:tc>
@@ -13851,7 +13903,7 @@
               <w:rPr>
                 <w:sz w:val="16"/>
               </w:rPr>
-              <w:t>15:59</w:t>
+              <w:t>22:59</w:t>
             </w:r>
           </w:p>
         </w:tc>
@@ -13865,7 +13917,7 @@
               <w:rPr>
                 <w:sz w:val="16"/>
               </w:rPr>
-              <w:t>16:15</w:t>
+              <w:t>23:04</w:t>
             </w:r>
           </w:p>
         </w:tc>
@@ -13879,7 +13931,7 @@
               <w:rPr>
                 <w:sz w:val="16"/>
               </w:rPr>
-              <w:t>15 min</w:t>
+              <w:t>5 min</w:t>
             </w:r>
           </w:p>
         </w:tc>
@@ -13911,7 +13963,7 @@
               <w:rPr>
                 <w:sz w:val="16"/>
               </w:rPr>
-              <w:t>Sab 26-sep</w:t>
+              <w:t>Vie 25-sep</w:t>
             </w:r>
           </w:p>
         </w:tc>
@@ -13926,7 +13978,7 @@
               <w:rPr>
                 <w:sz w:val="16"/>
               </w:rPr>
-              <w:t>07:36</w:t>
+              <w:t>15:59</w:t>
             </w:r>
           </w:p>
         </w:tc>
@@ -13941,7 +13993,7 @@
               <w:rPr>
                 <w:sz w:val="16"/>
               </w:rPr>
-              <w:t>19:17</w:t>
+              <w:t>16:15</w:t>
             </w:r>
           </w:p>
         </w:tc>
@@ -13956,7 +14008,7 @@
               <w:rPr>
                 <w:sz w:val="16"/>
               </w:rPr>
-              <w:t>701 min</w:t>
+              <w:t>15 min</w:t>
             </w:r>
           </w:p>
         </w:tc>
@@ -13986,7 +14038,7 @@
               <w:rPr>
                 <w:sz w:val="16"/>
               </w:rPr>
-              <w:t>Dom 27-sep</w:t>
+              <w:t>Sab 26-sep</w:t>
             </w:r>
           </w:p>
         </w:tc>
@@ -14000,7 +14052,7 @@
               <w:rPr>
                 <w:sz w:val="16"/>
               </w:rPr>
-              <w:t>01:37</w:t>
+              <w:t>07:36</w:t>
             </w:r>
           </w:p>
         </w:tc>
@@ -14014,7 +14066,7 @@
               <w:rPr>
                 <w:sz w:val="16"/>
               </w:rPr>
-              <w:t>14:24</w:t>
+              <w:t>19:17</w:t>
             </w:r>
           </w:p>
         </w:tc>
@@ -14028,7 +14080,7 @@
               <w:rPr>
                 <w:sz w:val="16"/>
               </w:rPr>
-              <w:t>767 min</w:t>
+              <w:t>701 min</w:t>
             </w:r>
           </w:p>
         </w:tc>
@@ -14075,7 +14127,7 @@
               <w:rPr>
                 <w:sz w:val="16"/>
               </w:rPr>
-              <w:t>15:59</w:t>
+              <w:t>01:37</w:t>
             </w:r>
           </w:p>
         </w:tc>
@@ -14090,7 +14142,7 @@
               <w:rPr>
                 <w:sz w:val="16"/>
               </w:rPr>
-              <w:t>16:15</w:t>
+              <w:t>14:24</w:t>
             </w:r>
           </w:p>
         </w:tc>
@@ -14105,7 +14157,7 @@
               <w:rPr>
                 <w:sz w:val="16"/>
               </w:rPr>
-              <w:t>15 min</w:t>
+              <w:t>767 min</w:t>
             </w:r>
           </w:p>
         </w:tc>
@@ -14135,7 +14187,7 @@
               <w:rPr>
                 <w:sz w:val="16"/>
               </w:rPr>
-              <w:t>Lun 28-sep</w:t>
+              <w:t>Dom 27-sep</w:t>
             </w:r>
           </w:p>
         </w:tc>
@@ -14149,7 +14201,7 @@
               <w:rPr>
                 <w:sz w:val="16"/>
               </w:rPr>
-              <w:t>01:26</w:t>
+              <w:t>15:59</w:t>
             </w:r>
           </w:p>
         </w:tc>
@@ -14163,7 +14215,7 @@
               <w:rPr>
                 <w:sz w:val="16"/>
               </w:rPr>
-              <w:t>10:01</w:t>
+              <w:t>16:15</w:t>
             </w:r>
           </w:p>
         </w:tc>
@@ -14177,7 +14229,7 @@
               <w:rPr>
                 <w:sz w:val="16"/>
               </w:rPr>
-              <w:t>515 min</w:t>
+              <w:t>15 min</w:t>
             </w:r>
           </w:p>
         </w:tc>
@@ -14224,7 +14276,7 @@
               <w:rPr>
                 <w:sz w:val="16"/>
               </w:rPr>
-              <w:t>16:00</w:t>
+              <w:t>01:26</w:t>
             </w:r>
           </w:p>
         </w:tc>
@@ -14239,7 +14291,7 @@
               <w:rPr>
                 <w:sz w:val="16"/>
               </w:rPr>
-              <w:t>16:15</w:t>
+              <w:t>10:01</w:t>
             </w:r>
           </w:p>
         </w:tc>
@@ -14254,7 +14306,7 @@
               <w:rPr>
                 <w:sz w:val="16"/>
               </w:rPr>
-              <w:t>15 min</w:t>
+              <w:t>515 min</w:t>
             </w:r>
           </w:p>
         </w:tc>
@@ -14270,7 +14322,7 @@
               <w:rPr>
                 <w:sz w:val="16"/>
               </w:rPr>
-              <w:t>04-aire-cams</w:t>
+              <w:t>03-lote3-sdk</w:t>
             </w:r>
           </w:p>
         </w:tc>
@@ -14284,7 +14336,7 @@
               <w:rPr>
                 <w:sz w:val="16"/>
               </w:rPr>
-              <w:t>Sab 26-sep</w:t>
+              <w:t>Lun 28-sep</w:t>
             </w:r>
           </w:p>
         </w:tc>
@@ -14298,7 +14350,7 @@
               <w:rPr>
                 <w:sz w:val="16"/>
               </w:rPr>
-              <w:t>07:36</w:t>
+              <w:t>16:00</w:t>
             </w:r>
           </w:p>
         </w:tc>
@@ -14312,7 +14364,7 @@
               <w:rPr>
                 <w:sz w:val="16"/>
               </w:rPr>
-              <w:t>19:17</w:t>
+              <w:t>16:15</w:t>
             </w:r>
           </w:p>
         </w:tc>
@@ -14326,7 +14378,7 @@
               <w:rPr>
                 <w:sz w:val="16"/>
               </w:rPr>
-              <w:t>701 min</w:t>
+              <w:t>15 min</w:t>
             </w:r>
           </w:p>
         </w:tc>
@@ -14358,7 +14410,7 @@
               <w:rPr>
                 <w:sz w:val="16"/>
               </w:rPr>
-              <w:t>Dom 27-sep</w:t>
+              <w:t>Sab 26-sep</w:t>
             </w:r>
           </w:p>
         </w:tc>
@@ -14373,7 +14425,7 @@
               <w:rPr>
                 <w:sz w:val="16"/>
               </w:rPr>
-              <w:t>01:32</w:t>
+              <w:t>07:36</w:t>
             </w:r>
           </w:p>
         </w:tc>
@@ -14388,7 +14440,7 @@
               <w:rPr>
                 <w:sz w:val="16"/>
               </w:rPr>
-              <w:t>14:24</w:t>
+              <w:t>19:17</w:t>
             </w:r>
           </w:p>
         </w:tc>
@@ -14403,7 +14455,7 @@
               <w:rPr>
                 <w:sz w:val="16"/>
               </w:rPr>
-              <w:t>771 min</w:t>
+              <w:t>701 min</w:t>
             </w:r>
           </w:p>
         </w:tc>
@@ -14433,7 +14485,7 @@
               <w:rPr>
                 <w:sz w:val="16"/>
               </w:rPr>
-              <w:t>Lun 28-sep</w:t>
+              <w:t>Dom 27-sep</w:t>
             </w:r>
           </w:p>
         </w:tc>
@@ -14447,7 +14499,7 @@
               <w:rPr>
                 <w:sz w:val="16"/>
               </w:rPr>
-              <w:t>01:23</w:t>
+              <w:t>01:32</w:t>
             </w:r>
           </w:p>
         </w:tc>
@@ -14461,7 +14513,7 @@
               <w:rPr>
                 <w:sz w:val="16"/>
               </w:rPr>
-              <w:t>10:01</w:t>
+              <w:t>14:24</w:t>
             </w:r>
           </w:p>
         </w:tc>
@@ -14475,7 +14527,7 @@
               <w:rPr>
                 <w:sz w:val="16"/>
               </w:rPr>
-              <w:t>518 min</w:t>
+              <w:t>771 min</w:t>
             </w:r>
           </w:p>
         </w:tc>
@@ -14492,7 +14544,7 @@
               <w:rPr>
                 <w:sz w:val="16"/>
               </w:rPr>
-              <w:t>05-meteo-feed</w:t>
+              <w:t>04-aire-cams</w:t>
             </w:r>
           </w:p>
         </w:tc>
@@ -14507,7 +14559,7 @@
               <w:rPr>
                 <w:sz w:val="16"/>
               </w:rPr>
-              <w:t>Sab 26-sep</w:t>
+              <w:t>Lun 28-sep</w:t>
             </w:r>
           </w:p>
         </w:tc>
@@ -14522,7 +14574,7 @@
               <w:rPr>
                 <w:sz w:val="16"/>
               </w:rPr>
-              <w:t>07:32</w:t>
+              <w:t>01:23</w:t>
             </w:r>
           </w:p>
         </w:tc>
@@ -14537,7 +14589,7 @@
               <w:rPr>
                 <w:sz w:val="16"/>
               </w:rPr>
-              <w:t>19:17</w:t>
+              <w:t>10:01</w:t>
             </w:r>
           </w:p>
         </w:tc>
@@ -14552,7 +14604,7 @@
               <w:rPr>
                 <w:sz w:val="16"/>
               </w:rPr>
-              <w:t>705 min</w:t>
+              <w:t>518 min</w:t>
             </w:r>
           </w:p>
         </w:tc>
@@ -14582,7 +14634,7 @@
               <w:rPr>
                 <w:sz w:val="16"/>
               </w:rPr>
-              <w:t>Dom 27-sep</w:t>
+              <w:t>Sab 26-sep</w:t>
             </w:r>
           </w:p>
         </w:tc>
@@ -14596,7 +14648,7 @@
               <w:rPr>
                 <w:sz w:val="16"/>
               </w:rPr>
-              <w:t>01:36</w:t>
+              <w:t>07:32</w:t>
             </w:r>
           </w:p>
         </w:tc>
@@ -14610,7 +14662,7 @@
               <w:rPr>
                 <w:sz w:val="16"/>
               </w:rPr>
-              <w:t>14:24</w:t>
+              <w:t>19:17</w:t>
             </w:r>
           </w:p>
         </w:tc>
@@ -14624,7 +14676,7 @@
               <w:rPr>
                 <w:sz w:val="16"/>
               </w:rPr>
-              <w:t>767 min</w:t>
+              <w:t>705 min</w:t>
             </w:r>
           </w:p>
         </w:tc>
@@ -14656,7 +14708,7 @@
               <w:rPr>
                 <w:sz w:val="16"/>
               </w:rPr>
-              <w:t>Lun 28-sep</w:t>
+              <w:t>Dom 27-sep</w:t>
             </w:r>
           </w:p>
         </w:tc>
@@ -14671,7 +14723,7 @@
               <w:rPr>
                 <w:sz w:val="16"/>
               </w:rPr>
-              <w:t>01:22</w:t>
+              <w:t>01:36</w:t>
             </w:r>
           </w:p>
         </w:tc>
@@ -14686,7 +14738,7 @@
               <w:rPr>
                 <w:sz w:val="16"/>
               </w:rPr>
-              <w:t>10:01</w:t>
+              <w:t>14:24</w:t>
             </w:r>
           </w:p>
         </w:tc>
@@ -14701,7 +14753,7 @@
               <w:rPr>
                 <w:sz w:val="16"/>
               </w:rPr>
-              <w:t>520 min</w:t>
+              <w:t>767 min</w:t>
             </w:r>
           </w:p>
         </w:tc>
@@ -14717,7 +14769,7 @@
               <w:rPr>
                 <w:sz w:val="16"/>
               </w:rPr>
-              <w:t>06-ferm-paho</w:t>
+              <w:t>05-meteo-feed</w:t>
             </w:r>
           </w:p>
         </w:tc>
@@ -14731,7 +14783,7 @@
               <w:rPr>
                 <w:sz w:val="16"/>
               </w:rPr>
-              <w:t>Vie 25-sep</w:t>
+              <w:t>Lun 28-sep</w:t>
             </w:r>
           </w:p>
         </w:tc>
@@ -14745,7 +14797,7 @@
               <w:rPr>
                 <w:sz w:val="16"/>
               </w:rPr>
-              <w:t>01:59</w:t>
+              <w:t>01:22</w:t>
             </w:r>
           </w:p>
         </w:tc>
@@ -14759,7 +14811,7 @@
               <w:rPr>
                 <w:sz w:val="16"/>
               </w:rPr>
-              <w:t>02:30</w:t>
+              <w:t>10:01</w:t>
             </w:r>
           </w:p>
         </w:tc>
@@ -14773,7 +14825,7 @@
               <w:rPr>
                 <w:sz w:val="16"/>
               </w:rPr>
-              <w:t>31 min</w:t>
+              <w:t>520 min</w:t>
             </w:r>
           </w:p>
         </w:tc>
@@ -14805,7 +14857,7 @@
               <w:rPr>
                 <w:sz w:val="16"/>
               </w:rPr>
-              <w:t>Sab 26-sep</w:t>
+              <w:t>Vie 25-sep</w:t>
             </w:r>
           </w:p>
         </w:tc>
@@ -14894,7 +14946,7 @@
               <w:rPr>
                 <w:sz w:val="16"/>
               </w:rPr>
-              <w:t>07:36</w:t>
+              <w:t>01:59</w:t>
             </w:r>
           </w:p>
         </w:tc>
@@ -14908,7 +14960,7 @@
               <w:rPr>
                 <w:sz w:val="16"/>
               </w:rPr>
-              <w:t>19:17</w:t>
+              <w:t>02:30</w:t>
             </w:r>
           </w:p>
         </w:tc>
@@ -14922,7 +14974,7 @@
               <w:rPr>
                 <w:sz w:val="16"/>
               </w:rPr>
-              <w:t>701 min</w:t>
+              <w:t>31 min</w:t>
             </w:r>
           </w:p>
         </w:tc>
@@ -14954,7 +15006,7 @@
               <w:rPr>
                 <w:sz w:val="16"/>
               </w:rPr>
-              <w:t>Dom 27-sep</w:t>
+              <w:t>Sab 26-sep</w:t>
             </w:r>
           </w:p>
         </w:tc>
@@ -14969,7 +15021,7 @@
               <w:rPr>
                 <w:sz w:val="16"/>
               </w:rPr>
-              <w:t>01:36</w:t>
+              <w:t>07:36</w:t>
             </w:r>
           </w:p>
         </w:tc>
@@ -14984,7 +15036,7 @@
               <w:rPr>
                 <w:sz w:val="16"/>
               </w:rPr>
-              <w:t>14:24</w:t>
+              <w:t>19:17</w:t>
             </w:r>
           </w:p>
         </w:tc>
@@ -14999,7 +15051,7 @@
               <w:rPr>
                 <w:sz w:val="16"/>
               </w:rPr>
-              <w:t>767 min</w:t>
+              <w:t>701 min</w:t>
             </w:r>
           </w:p>
         </w:tc>
@@ -15029,7 +15081,7 @@
               <w:rPr>
                 <w:sz w:val="16"/>
               </w:rPr>
-              <w:t>Lun 28-sep</w:t>
+              <w:t>Dom 27-sep</w:t>
             </w:r>
           </w:p>
         </w:tc>
@@ -15043,7 +15095,7 @@
               <w:rPr>
                 <w:sz w:val="16"/>
               </w:rPr>
-              <w:t>01:26</w:t>
+              <w:t>01:36</w:t>
             </w:r>
           </w:p>
         </w:tc>
@@ -15057,7 +15109,7 @@
               <w:rPr>
                 <w:sz w:val="16"/>
               </w:rPr>
-              <w:t>10:01</w:t>
+              <w:t>14:24</w:t>
             </w:r>
           </w:p>
         </w:tc>
@@ -15071,7 +15123,7 @@
               <w:rPr>
                 <w:sz w:val="16"/>
               </w:rPr>
-              <w:t>515 min</w:t>
+              <w:t>767 min</w:t>
             </w:r>
           </w:p>
         </w:tc>
@@ -15088,7 +15140,7 @@
               <w:rPr>
                 <w:sz w:val="16"/>
               </w:rPr>
-              <w:t>07-campo-era5</w:t>
+              <w:t>06-ferm-paho</w:t>
             </w:r>
           </w:p>
         </w:tc>
@@ -15103,7 +15155,7 @@
               <w:rPr>
                 <w:sz w:val="16"/>
               </w:rPr>
-              <w:t>Sab 26-sep</w:t>
+              <w:t>Lun 28-sep</w:t>
             </w:r>
           </w:p>
         </w:tc>
@@ -15118,7 +15170,7 @@
               <w:rPr>
                 <w:sz w:val="16"/>
               </w:rPr>
-              <w:t>07:36</w:t>
+              <w:t>01:26</w:t>
             </w:r>
           </w:p>
         </w:tc>
@@ -15133,7 +15185,7 @@
               <w:rPr>
                 <w:sz w:val="16"/>
               </w:rPr>
-              <w:t>19:17</w:t>
+              <w:t>10:01</w:t>
             </w:r>
           </w:p>
         </w:tc>
@@ -15148,7 +15200,7 @@
               <w:rPr>
                 <w:sz w:val="16"/>
               </w:rPr>
-              <w:t>701 min</w:t>
+              <w:t>515 min</w:t>
             </w:r>
           </w:p>
         </w:tc>
@@ -15178,7 +15230,7 @@
               <w:rPr>
                 <w:sz w:val="16"/>
               </w:rPr>
-              <w:t>Dom 27-sep</w:t>
+              <w:t>Sab 26-sep</w:t>
             </w:r>
           </w:p>
         </w:tc>
@@ -15192,7 +15244,7 @@
               <w:rPr>
                 <w:sz w:val="16"/>
               </w:rPr>
-              <w:t>01:37</w:t>
+              <w:t>07:36</w:t>
             </w:r>
           </w:p>
         </w:tc>
@@ -15206,7 +15258,7 @@
               <w:rPr>
                 <w:sz w:val="16"/>
               </w:rPr>
-              <w:t>14:24</w:t>
+              <w:t>19:17</w:t>
             </w:r>
           </w:p>
         </w:tc>
@@ -15220,7 +15272,7 @@
               <w:rPr>
                 <w:sz w:val="16"/>
               </w:rPr>
-              <w:t>767 min</w:t>
+              <w:t>701 min</w:t>
             </w:r>
           </w:p>
         </w:tc>
@@ -15252,7 +15304,7 @@
               <w:rPr>
                 <w:sz w:val="16"/>
               </w:rPr>
-              <w:t>Lun 28-sep</w:t>
+              <w:t>Dom 27-sep</w:t>
             </w:r>
           </w:p>
         </w:tc>
@@ -15267,7 +15319,7 @@
               <w:rPr>
                 <w:sz w:val="16"/>
               </w:rPr>
-              <w:t>01:26</w:t>
+              <w:t>01:37</w:t>
             </w:r>
           </w:p>
         </w:tc>
@@ -15282,7 +15334,7 @@
               <w:rPr>
                 <w:sz w:val="16"/>
               </w:rPr>
-              <w:t>10:01</w:t>
+              <w:t>14:24</w:t>
             </w:r>
           </w:p>
         </w:tc>
@@ -15297,7 +15349,7 @@
               <w:rPr>
                 <w:sz w:val="16"/>
               </w:rPr>
-              <w:t>516 min</w:t>
+              <w:t>767 min</w:t>
             </w:r>
           </w:p>
         </w:tc>
@@ -15313,7 +15365,7 @@
               <w:rPr>
                 <w:sz w:val="16"/>
               </w:rPr>
-              <w:t>08-dosel-rest</w:t>
+              <w:t>07-campo-era5</w:t>
             </w:r>
           </w:p>
         </w:tc>
@@ -15327,7 +15379,7 @@
               <w:rPr>
                 <w:sz w:val="16"/>
               </w:rPr>
-              <w:t>Vie 25-sep</w:t>
+              <w:t>Lun 28-sep</w:t>
             </w:r>
           </w:p>
         </w:tc>
@@ -15341,7 +15393,7 @@
               <w:rPr>
                 <w:sz w:val="16"/>
               </w:rPr>
-              <w:t>11:59</w:t>
+              <w:t>01:26</w:t>
             </w:r>
           </w:p>
         </w:tc>
@@ -15355,7 +15407,7 @@
               <w:rPr>
                 <w:sz w:val="16"/>
               </w:rPr>
-              <w:t>12:20</w:t>
+              <w:t>10:01</w:t>
             </w:r>
           </w:p>
         </w:tc>
@@ -15369,7 +15421,7 @@
               <w:rPr>
                 <w:sz w:val="16"/>
               </w:rPr>
-              <w:t>20 min</w:t>
+              <w:t>516 min</w:t>
             </w:r>
           </w:p>
         </w:tc>
@@ -15401,7 +15453,7 @@
               <w:rPr>
                 <w:sz w:val="16"/>
               </w:rPr>
-              <w:t>Sab 26-sep</w:t>
+              <w:t>Vie 25-sep</w:t>
             </w:r>
           </w:p>
         </w:tc>
@@ -15416,7 +15468,7 @@
               <w:rPr>
                 <w:sz w:val="16"/>
               </w:rPr>
-              <w:t>07:36</w:t>
+              <w:t>11:59</w:t>
             </w:r>
           </w:p>
         </w:tc>
@@ -15431,7 +15483,7 @@
               <w:rPr>
                 <w:sz w:val="16"/>
               </w:rPr>
-              <w:t>19:17</w:t>
+              <w:t>12:20</w:t>
             </w:r>
           </w:p>
         </w:tc>
@@ -15446,7 +15498,7 @@
               <w:rPr>
                 <w:sz w:val="16"/>
               </w:rPr>
-              <w:t>701 min</w:t>
+              <w:t>20 min</w:t>
             </w:r>
           </w:p>
         </w:tc>
@@ -15476,7 +15528,7 @@
               <w:rPr>
                 <w:sz w:val="16"/>
               </w:rPr>
-              <w:t>Dom 27-sep</w:t>
+              <w:t>Sab 26-sep</w:t>
             </w:r>
           </w:p>
         </w:tc>
@@ -15490,7 +15542,7 @@
               <w:rPr>
                 <w:sz w:val="16"/>
               </w:rPr>
-              <w:t>01:37</w:t>
+              <w:t>07:36</w:t>
             </w:r>
           </w:p>
         </w:tc>
@@ -15504,7 +15556,7 @@
               <w:rPr>
                 <w:sz w:val="16"/>
               </w:rPr>
-              <w:t>14:24</w:t>
+              <w:t>19:17</w:t>
             </w:r>
           </w:p>
         </w:tc>
@@ -15518,7 +15570,7 @@
               <w:rPr>
                 <w:sz w:val="16"/>
               </w:rPr>
-              <w:t>767 min</w:t>
+              <w:t>701 min</w:t>
             </w:r>
           </w:p>
         </w:tc>
@@ -15550,7 +15602,7 @@
               <w:rPr>
                 <w:sz w:val="16"/>
               </w:rPr>
-              <w:t>Lun 28-sep</w:t>
+              <w:t>Dom 27-sep</w:t>
             </w:r>
           </w:p>
         </w:tc>
@@ -15565,7 +15617,7 @@
               <w:rPr>
                 <w:sz w:val="16"/>
               </w:rPr>
-              <w:t>01:26</w:t>
+              <w:t>01:37</w:t>
             </w:r>
           </w:p>
         </w:tc>
@@ -15580,7 +15632,7 @@
               <w:rPr>
                 <w:sz w:val="16"/>
               </w:rPr>
-              <w:t>10:01</w:t>
+              <w:t>14:24</w:t>
             </w:r>
           </w:p>
         </w:tc>
@@ -15595,7 +15647,7 @@
               <w:rPr>
                 <w:sz w:val="16"/>
               </w:rPr>
-              <w:t>516 min</w:t>
+              <w:t>767 min</w:t>
             </w:r>
           </w:p>
         </w:tc>
@@ -15639,7 +15691,7 @@
               <w:rPr>
                 <w:sz w:val="16"/>
               </w:rPr>
-              <w:t>11:59</w:t>
+              <w:t>01:26</w:t>
             </w:r>
           </w:p>
         </w:tc>
@@ -15653,7 +15705,7 @@
               <w:rPr>
                 <w:sz w:val="16"/>
               </w:rPr>
-              <w:t>12:20</w:t>
+              <w:t>10:01</w:t>
             </w:r>
           </w:p>
         </w:tc>
@@ -15667,7 +15719,7 @@
               <w:rPr>
                 <w:sz w:val="16"/>
               </w:rPr>
-              <w:t>20 min</w:t>
+              <w:t>516 min</w:t>
             </w:r>
           </w:p>
         </w:tc>
@@ -15684,7 +15736,7 @@
               <w:rPr>
                 <w:sz w:val="16"/>
               </w:rPr>
-              <w:t>09-riego-wokwi</w:t>
+              <w:t>08-dosel-rest</w:t>
             </w:r>
           </w:p>
         </w:tc>
@@ -15699,7 +15751,7 @@
               <w:rPr>
                 <w:sz w:val="16"/>
               </w:rPr>
-              <w:t>Vie 25-sep</w:t>
+              <w:t>Lun 28-sep</w:t>
             </w:r>
           </w:p>
         </w:tc>
@@ -15714,7 +15766,7 @@
               <w:rPr>
                 <w:sz w:val="16"/>
               </w:rPr>
-              <w:t>09:58</w:t>
+              <w:t>11:59</w:t>
             </w:r>
           </w:p>
         </w:tc>
@@ -15729,7 +15781,7 @@
               <w:rPr>
                 <w:sz w:val="16"/>
               </w:rPr>
-              <w:t>10:07</w:t>
+              <w:t>12:20</w:t>
             </w:r>
           </w:p>
         </w:tc>
@@ -15744,7 +15796,7 @@
               <w:rPr>
                 <w:sz w:val="16"/>
               </w:rPr>
-              <w:t>9 min</w:t>
+              <w:t>20 min</w:t>
             </w:r>
           </w:p>
         </w:tc>
@@ -15788,21 +15840,21 @@
               <w:rPr>
                 <w:sz w:val="16"/>
               </w:rPr>
+              <w:t>09:58</w:t>
+            </w:r>
+          </w:p>
+        </w:tc>
+        <w:tc>
+          <w:tcPr>
+            <w:tcW w:type="dxa" w:w="1417"/>
+          </w:tcPr>
+          <w:p>
+            <w:r/>
+            <w:r>
+              <w:rPr>
+                <w:sz w:val="16"/>
+              </w:rPr>
               <w:t>10:07</w:t>
-            </w:r>
-          </w:p>
-        </w:tc>
-        <w:tc>
-          <w:tcPr>
-            <w:tcW w:type="dxa" w:w="1417"/>
-          </w:tcPr>
-          <w:p>
-            <w:r/>
-            <w:r>
-              <w:rPr>
-                <w:sz w:val="16"/>
-              </w:rPr>
-              <w:t>10:16</w:t>
             </w:r>
           </w:p>
         </w:tc>
@@ -15863,7 +15915,7 @@
               <w:rPr>
                 <w:sz w:val="16"/>
               </w:rPr>
-              <w:t>10:19</w:t>
+              <w:t>10:07</w:t>
             </w:r>
           </w:p>
         </w:tc>
@@ -15878,7 +15930,7 @@
               <w:rPr>
                 <w:sz w:val="16"/>
               </w:rPr>
-              <w:t>10:31</w:t>
+              <w:t>10:16</w:t>
             </w:r>
           </w:p>
         </w:tc>
@@ -15893,7 +15945,7 @@
               <w:rPr>
                 <w:sz w:val="16"/>
               </w:rPr>
-              <w:t>12 min</w:t>
+              <w:t>9 min</w:t>
             </w:r>
           </w:p>
         </w:tc>
@@ -15906,7 +15958,7 @@
           <w:b w:val="0"/>
           <w:sz w:val="18"/>
         </w:rPr>
-        <w:t>Desconexiones programadas (hora local): nodo 06 02:00–02:30, nodo 10 03:00–03:10, nodo 08 12:00–12:20 (corte de enlace simulado) y nodo 03 16:00–16:15; hasta el 26/09 las ejecutó cron en la VM y desde entonces el supervisor local con el mismo horario. Los nodos Wokwi presentan además huecos propios: solo transmiten mientras la simulación está abierta, y la sustentación reproduce una desconexión y reconexión en vivo. El 26/09 no transmitieron hasta la noche (equipo apagado y cola de compilación de wokwi.com saturada); desde entonces el firmware se compila en local con PlatformIO y se simula con Wokwi for VS Code (wokwi/vscode/), sin cambiar el código, el ID ni la clave de cada dispositivo.</w:t>
+        <w:t>Desconexiones programadas (hora local): nodo 06 02:00–02:30, nodo 10 03:00–03:10, nodo 08 12:00–12:20 (corte de enlace simulado) y nodo 03 16:00–16:15; hasta el 26/09 las ejecutó cron en la VM y desde entonces el supervisor local con el mismo horario. Los nodos Wokwi presentan además huecos propios: solo transmiten mientras la simulación está abierta, y la sustentación reproduce una desconexión y reconexión en vivo. El 26/09 no transmitieron hasta la noche (equipo apagado y cola de compilación de wokwi.com saturada); desde entonces el firmware se compila en local con PlatformIO y se simula con Wokwi for VS Code (wokwi/vscode/), sin cambiar el código, el ID ni la clave de cada dispositivo. Desconexión controlada documentada: el 28/09 a las 23:25 se detuvo el simulador del nodo 09 (Stop en Wokwi for VS Code); IoT Central lo marcó Desconectado (figura 12) y a las 23:29 se reanudó y volvió a Conectado con telemetría, sin intervención en la nube.</w:t>
       </w:r>
     </w:p>
     <w:p>
@@ -15916,6 +15968,58 @@
           <w:sz w:val="18"/>
         </w:rPr>
         <w:t>Desconexión no planificada (26/09): el crédito de la suscripción Azure for Students se agotó, la suscripción pasó a solo lectura y la VM quedó desasignada; los nodos 03–08 y 10 dejaron de transmitir a las 07:36 y se restablecieron a las 19:17 desde un equipo local con el mismo código y las mismas claves, sin reprovisionar. El hueco es visible en la figura 11 y en IoT Central, y demuestra la reconexión de la flota tras la caída del gateway de borde.</w:t>
+      </w:r>
+    </w:p>
+    <w:p>
+      <w:pPr>
+        <w:jc w:val="center"/>
+      </w:pPr>
+      <w:r>
+        <w:drawing>
+          <wp:inline xmlns:a="http://schemas.openxmlformats.org/drawingml/2006/main" xmlns:pic="http://schemas.openxmlformats.org/drawingml/2006/picture">
+            <wp:extent cx="5940000" cy="2925914"/>
+            <wp:docPr id="13" name="Picture 13"/>
+            <wp:cNvGraphicFramePr>
+              <a:graphicFrameLocks noChangeAspect="1"/>
+            </wp:cNvGraphicFramePr>
+            <a:graphic>
+              <a:graphicData uri="http://schemas.openxmlformats.org/drawingml/2006/picture">
+                <pic:pic>
+                  <pic:nvPicPr>
+                    <pic:cNvPr id="0" name="09-desconectado.png"/>
+                    <pic:cNvPicPr/>
+                  </pic:nvPicPr>
+                  <pic:blipFill>
+                    <a:blip r:embed="rId23"/>
+                    <a:stretch>
+                      <a:fillRect/>
+                    </a:stretch>
+                  </pic:blipFill>
+                  <pic:spPr>
+                    <a:xfrm>
+                      <a:off x="0" y="0"/>
+                      <a:ext cx="5940000" cy="2925914"/>
+                    </a:xfrm>
+                    <a:prstGeom prst="rect"/>
+                  </pic:spPr>
+                </pic:pic>
+              </a:graphicData>
+            </a:graphic>
+          </wp:inline>
+        </w:drawing>
+      </w:r>
+    </w:p>
+    <w:p>
+      <w:pPr>
+        <w:jc w:val="center"/>
+      </w:pPr>
+      <w:r>
+        <w:rPr>
+          <w:i/>
+          <w:color w:val="555555"/>
+          <w:sz w:val="17"/>
+        </w:rPr>
+        <w:t>Figura 12. Estado Desconectado en IoT Central.</w:t>
       </w:r>
     </w:p>
     <w:p>
@@ -16053,8 +16157,8 @@
       <w:r>
         <w:drawing>
           <wp:inline xmlns:a="http://schemas.openxmlformats.org/drawingml/2006/main" xmlns:pic="http://schemas.openxmlformats.org/drawingml/2006/picture">
-            <wp:extent cx="5940000" cy="2923594"/>
-            <wp:docPr id="12" name="Picture 12"/>
+            <wp:extent cx="5940000" cy="2918953"/>
+            <wp:docPr id="14" name="Picture 14"/>
             <wp:cNvGraphicFramePr>
               <a:graphicFrameLocks noChangeAspect="1"/>
             </wp:cNvGraphicFramePr>
@@ -16066,7 +16170,7 @@
                     <pic:cNvPicPr/>
                   </pic:nvPicPr>
                   <pic:blipFill>
-                    <a:blip r:embed="rId22"/>
+                    <a:blip r:embed="rId24"/>
                     <a:stretch>
                       <a:fillRect/>
                     </a:stretch>
@@ -16074,7 +16178,7 @@
                   <pic:spPr>
                     <a:xfrm>
                       <a:off x="0" y="0"/>
-                      <a:ext cx="5940000" cy="2923594"/>
+                      <a:ext cx="5940000" cy="2918953"/>
                     </a:xfrm>
                     <a:prstGeom prst="rect"/>
                   </pic:spPr>
@@ -16105,8 +16209,8 @@
       <w:r>
         <w:drawing>
           <wp:inline xmlns:a="http://schemas.openxmlformats.org/drawingml/2006/main" xmlns:pic="http://schemas.openxmlformats.org/drawingml/2006/picture">
-            <wp:extent cx="5940000" cy="2747250"/>
-            <wp:docPr id="13" name="Picture 13"/>
+            <wp:extent cx="5940000" cy="2925914"/>
+            <wp:docPr id="15" name="Picture 15"/>
             <wp:cNvGraphicFramePr>
               <a:graphicFrameLocks noChangeAspect="1"/>
             </wp:cNvGraphicFramePr>
@@ -16118,7 +16222,7 @@
                     <pic:cNvPicPr/>
                   </pic:nvPicPr>
                   <pic:blipFill>
-                    <a:blip r:embed="rId23"/>
+                    <a:blip r:embed="rId25"/>
                     <a:stretch>
                       <a:fillRect/>
                     </a:stretch>
@@ -16126,7 +16230,7 @@
                   <pic:spPr>
                     <a:xfrm>
                       <a:off x="0" y="0"/>
-                      <a:ext cx="5940000" cy="2747250"/>
+                      <a:ext cx="5940000" cy="2925914"/>
                     </a:xfrm>
                     <a:prstGeom prst="rect"/>
                   </pic:spPr>
@@ -16157,8 +16261,8 @@
       <w:r>
         <w:drawing>
           <wp:inline xmlns:a="http://schemas.openxmlformats.org/drawingml/2006/main" xmlns:pic="http://schemas.openxmlformats.org/drawingml/2006/picture">
-            <wp:extent cx="5940000" cy="2747250"/>
-            <wp:docPr id="14" name="Picture 14"/>
+            <wp:extent cx="5940000" cy="2925914"/>
+            <wp:docPr id="16" name="Picture 16"/>
             <wp:cNvGraphicFramePr>
               <a:graphicFrameLocks noChangeAspect="1"/>
             </wp:cNvGraphicFramePr>
@@ -16170,7 +16274,7 @@
                     <pic:cNvPicPr/>
                   </pic:nvPicPr>
                   <pic:blipFill>
-                    <a:blip r:embed="rId24"/>
+                    <a:blip r:embed="rId26"/>
                     <a:stretch>
                       <a:fillRect/>
                     </a:stretch>
@@ -16178,7 +16282,7 @@
                   <pic:spPr>
                     <a:xfrm>
                       <a:off x="0" y="0"/>
-                      <a:ext cx="5940000" cy="2747250"/>
+                      <a:ext cx="5940000" cy="2925914"/>
                     </a:xfrm>
                     <a:prstGeom prst="rect"/>
                   </pic:spPr>
@@ -16209,8 +16313,8 @@
       <w:r>
         <w:drawing>
           <wp:inline xmlns:a="http://schemas.openxmlformats.org/drawingml/2006/main" xmlns:pic="http://schemas.openxmlformats.org/drawingml/2006/picture">
-            <wp:extent cx="5940000" cy="2747250"/>
-            <wp:docPr id="15" name="Picture 15"/>
+            <wp:extent cx="5940000" cy="2925914"/>
+            <wp:docPr id="17" name="Picture 17"/>
             <wp:cNvGraphicFramePr>
               <a:graphicFrameLocks noChangeAspect="1"/>
             </wp:cNvGraphicFramePr>
@@ -16222,7 +16326,7 @@
                     <pic:cNvPicPr/>
                   </pic:nvPicPr>
                   <pic:blipFill>
-                    <a:blip r:embed="rId25"/>
+                    <a:blip r:embed="rId27"/>
                     <a:stretch>
                       <a:fillRect/>
                     </a:stretch>
@@ -16230,7 +16334,7 @@
                   <pic:spPr>
                     <a:xfrm>
                       <a:off x="0" y="0"/>
-                      <a:ext cx="5940000" cy="2747250"/>
+                      <a:ext cx="5940000" cy="2925914"/>
                     </a:xfrm>
                     <a:prstGeom prst="rect"/>
                   </pic:spPr>
@@ -16262,7 +16366,7 @@
         <w:drawing>
           <wp:inline xmlns:a="http://schemas.openxmlformats.org/drawingml/2006/main" xmlns:pic="http://schemas.openxmlformats.org/drawingml/2006/picture">
             <wp:extent cx="5940000" cy="2925914"/>
-            <wp:docPr id="16" name="Picture 16"/>
+            <wp:docPr id="18" name="Picture 18"/>
             <wp:cNvGraphicFramePr>
               <a:graphicFrameLocks noChangeAspect="1"/>
             </wp:cNvGraphicFramePr>
@@ -16274,7 +16378,7 @@
                     <pic:cNvPicPr/>
                   </pic:nvPicPr>
                   <pic:blipFill>
-                    <a:blip r:embed="rId26"/>
+                    <a:blip r:embed="rId28"/>
                     <a:stretch>
                       <a:fillRect/>
                     </a:stretch>
@@ -16314,7 +16418,7 @@
         <w:drawing>
           <wp:inline xmlns:a="http://schemas.openxmlformats.org/drawingml/2006/main" xmlns:pic="http://schemas.openxmlformats.org/drawingml/2006/picture">
             <wp:extent cx="5940000" cy="3123141"/>
-            <wp:docPr id="17" name="Picture 17"/>
+            <wp:docPr id="19" name="Picture 19"/>
             <wp:cNvGraphicFramePr>
               <a:graphicFrameLocks noChangeAspect="1"/>
             </wp:cNvGraphicFramePr>
@@ -16326,7 +16430,7 @@
                     <pic:cNvPicPr/>
                   </pic:nvPicPr>
                   <pic:blipFill>
-                    <a:blip r:embed="rId27"/>
+                    <a:blip r:embed="rId29"/>
                     <a:stretch>
                       <a:fillRect/>
                     </a:stretch>
@@ -16366,7 +16470,7 @@
         <w:drawing>
           <wp:inline xmlns:a="http://schemas.openxmlformats.org/drawingml/2006/main" xmlns:pic="http://schemas.openxmlformats.org/drawingml/2006/picture">
             <wp:extent cx="5940000" cy="2925914"/>
-            <wp:docPr id="18" name="Picture 18"/>
+            <wp:docPr id="20" name="Picture 20"/>
             <wp:cNvGraphicFramePr>
               <a:graphicFrameLocks noChangeAspect="1"/>
             </wp:cNvGraphicFramePr>
@@ -16378,7 +16482,7 @@
                     <pic:cNvPicPr/>
                   </pic:nvPicPr>
                   <pic:blipFill>
-                    <a:blip r:embed="rId28"/>
+                    <a:blip r:embed="rId30"/>
                     <a:stretch>
                       <a:fillRect/>
                     </a:stretch>
@@ -16883,6 +16987,1250 @@
       </w:tr>
     </w:tbl>
     <w:p/>
+    <w:p>
+      <w:pPr>
+        <w:pStyle w:val="Heading2"/>
+      </w:pPr>
+      <w:r>
+        <w:t>Alertas disparadas en la ventana de 4 días</w:t>
+      </w:r>
+    </w:p>
+    <w:p>
+      <w:r>
+        <w:rPr>
+          <w:b w:val="0"/>
+          <w:sz w:val="18"/>
+        </w:rPr>
+        <w:t>IoT Central no publica por API el historial de disparos, así que cada regla se reevaluó sobre la telemetría de la ventana con la misma condición y agregación (tools/rule_events.py → analisis/alertas_4dias.csv). Un evento es una racha continua de ventanas que cumplen la condición: la regla dispara al entrar y se rearma al salir.</w:t>
+      </w:r>
+    </w:p>
+    <w:tbl>
+      <w:tblPr>
+        <w:tblStyle w:val="TableGrid"/>
+        <w:tblW w:type="auto" w:w="0"/>
+        <w:jc w:val="center"/>
+        <w:tblLook w:firstColumn="1" w:firstRow="1" w:lastColumn="0" w:lastRow="0" w:noHBand="0" w:noVBand="1" w:val="04A0"/>
+      </w:tblPr>
+      <w:tblGrid>
+        <w:gridCol w:w="1662"/>
+        <w:gridCol w:w="1662"/>
+        <w:gridCol w:w="1662"/>
+        <w:gridCol w:w="1662"/>
+        <w:gridCol w:w="1662"/>
+        <w:gridCol w:w="1662"/>
+      </w:tblGrid>
+      <w:tr>
+        <w:tc>
+          <w:tcPr>
+            <w:tcW w:type="dxa" w:w="2381"/>
+            <w:shd w:val="clear" w:color="auto" w:fill="6B3A1E"/>
+          </w:tcPr>
+          <w:p>
+            <w:r/>
+            <w:r>
+              <w:rPr>
+                <w:b/>
+                <w:color w:val="FFFFFF"/>
+                <w:sz w:val="16"/>
+              </w:rPr>
+              <w:t>Regla</w:t>
+            </w:r>
+          </w:p>
+        </w:tc>
+        <w:tc>
+          <w:tcPr>
+            <w:tcW w:type="dxa" w:w="1304"/>
+            <w:shd w:val="clear" w:color="auto" w:fill="6B3A1E"/>
+          </w:tcPr>
+          <w:p>
+            <w:r/>
+            <w:r>
+              <w:rPr>
+                <w:b/>
+                <w:color w:val="FFFFFF"/>
+                <w:sz w:val="16"/>
+              </w:rPr>
+              <w:t>Vie 25-sep</w:t>
+            </w:r>
+          </w:p>
+        </w:tc>
+        <w:tc>
+          <w:tcPr>
+            <w:tcW w:type="dxa" w:w="1304"/>
+            <w:shd w:val="clear" w:color="auto" w:fill="6B3A1E"/>
+          </w:tcPr>
+          <w:p>
+            <w:r/>
+            <w:r>
+              <w:rPr>
+                <w:b/>
+                <w:color w:val="FFFFFF"/>
+                <w:sz w:val="16"/>
+              </w:rPr>
+              <w:t>Sab 26-sep</w:t>
+            </w:r>
+          </w:p>
+        </w:tc>
+        <w:tc>
+          <w:tcPr>
+            <w:tcW w:type="dxa" w:w="1304"/>
+            <w:shd w:val="clear" w:color="auto" w:fill="6B3A1E"/>
+          </w:tcPr>
+          <w:p>
+            <w:r/>
+            <w:r>
+              <w:rPr>
+                <w:b/>
+                <w:color w:val="FFFFFF"/>
+                <w:sz w:val="16"/>
+              </w:rPr>
+              <w:t>Dom 27-sep</w:t>
+            </w:r>
+          </w:p>
+        </w:tc>
+        <w:tc>
+          <w:tcPr>
+            <w:tcW w:type="dxa" w:w="1304"/>
+            <w:shd w:val="clear" w:color="auto" w:fill="6B3A1E"/>
+          </w:tcPr>
+          <w:p>
+            <w:r/>
+            <w:r>
+              <w:rPr>
+                <w:b/>
+                <w:color w:val="FFFFFF"/>
+                <w:sz w:val="16"/>
+              </w:rPr>
+              <w:t>Lun 28-sep</w:t>
+            </w:r>
+          </w:p>
+        </w:tc>
+        <w:tc>
+          <w:tcPr>
+            <w:tcW w:type="dxa" w:w="907"/>
+            <w:shd w:val="clear" w:color="auto" w:fill="6B3A1E"/>
+          </w:tcPr>
+          <w:p>
+            <w:r/>
+            <w:r>
+              <w:rPr>
+                <w:b/>
+                <w:color w:val="FFFFFF"/>
+                <w:sz w:val="16"/>
+              </w:rPr>
+              <w:t>Total</w:t>
+            </w:r>
+          </w:p>
+        </w:tc>
+      </w:tr>
+      <w:tr>
+        <w:tc>
+          <w:tcPr>
+            <w:tcW w:type="dxa" w:w="2381"/>
+          </w:tcPr>
+          <w:p>
+            <w:r/>
+            <w:r>
+              <w:rPr>
+                <w:sz w:val="16"/>
+              </w:rPr>
+              <w:t>R1 Suelo seco</w:t>
+            </w:r>
+          </w:p>
+        </w:tc>
+        <w:tc>
+          <w:tcPr>
+            <w:tcW w:type="dxa" w:w="1304"/>
+          </w:tcPr>
+          <w:p>
+            <w:r/>
+            <w:r>
+              <w:rPr>
+                <w:sz w:val="16"/>
+              </w:rPr>
+              <w:t>2</w:t>
+            </w:r>
+          </w:p>
+        </w:tc>
+        <w:tc>
+          <w:tcPr>
+            <w:tcW w:type="dxa" w:w="1304"/>
+          </w:tcPr>
+          <w:p>
+            <w:r/>
+            <w:r>
+              <w:rPr>
+                <w:sz w:val="16"/>
+              </w:rPr>
+              <w:t>1</w:t>
+            </w:r>
+          </w:p>
+        </w:tc>
+        <w:tc>
+          <w:tcPr>
+            <w:tcW w:type="dxa" w:w="1304"/>
+          </w:tcPr>
+          <w:p>
+            <w:r/>
+            <w:r>
+              <w:rPr>
+                <w:sz w:val="16"/>
+              </w:rPr>
+              <w:t>2</w:t>
+            </w:r>
+          </w:p>
+        </w:tc>
+        <w:tc>
+          <w:tcPr>
+            <w:tcW w:type="dxa" w:w="1304"/>
+          </w:tcPr>
+          <w:p>
+            <w:r/>
+            <w:r>
+              <w:rPr>
+                <w:sz w:val="16"/>
+              </w:rPr>
+              <w:t>1</w:t>
+            </w:r>
+          </w:p>
+        </w:tc>
+        <w:tc>
+          <w:tcPr>
+            <w:tcW w:type="dxa" w:w="907"/>
+          </w:tcPr>
+          <w:p>
+            <w:r/>
+            <w:r>
+              <w:rPr>
+                <w:sz w:val="16"/>
+              </w:rPr>
+              <w:t>6</w:t>
+            </w:r>
+          </w:p>
+        </w:tc>
+      </w:tr>
+      <w:tr>
+        <w:tc>
+          <w:tcPr>
+            <w:tcW w:type="dxa" w:w="2381"/>
+            <w:shd w:val="clear" w:color="auto" w:fill="F7EFE6"/>
+          </w:tcPr>
+          <w:p>
+            <w:r/>
+            <w:r>
+              <w:rPr>
+                <w:sz w:val="16"/>
+              </w:rPr>
+              <w:t>R2 Fermentacion alta</w:t>
+            </w:r>
+          </w:p>
+        </w:tc>
+        <w:tc>
+          <w:tcPr>
+            <w:tcW w:type="dxa" w:w="1304"/>
+            <w:shd w:val="clear" w:color="auto" w:fill="F7EFE6"/>
+          </w:tcPr>
+          <w:p>
+            <w:r/>
+            <w:r>
+              <w:rPr>
+                <w:sz w:val="16"/>
+              </w:rPr>
+              <w:t>0</w:t>
+            </w:r>
+          </w:p>
+        </w:tc>
+        <w:tc>
+          <w:tcPr>
+            <w:tcW w:type="dxa" w:w="1304"/>
+            <w:shd w:val="clear" w:color="auto" w:fill="F7EFE6"/>
+          </w:tcPr>
+          <w:p>
+            <w:r/>
+            <w:r>
+              <w:rPr>
+                <w:sz w:val="16"/>
+              </w:rPr>
+              <w:t>0</w:t>
+            </w:r>
+          </w:p>
+        </w:tc>
+        <w:tc>
+          <w:tcPr>
+            <w:tcW w:type="dxa" w:w="1304"/>
+            <w:shd w:val="clear" w:color="auto" w:fill="F7EFE6"/>
+          </w:tcPr>
+          <w:p>
+            <w:r/>
+            <w:r>
+              <w:rPr>
+                <w:sz w:val="16"/>
+              </w:rPr>
+              <w:t>0</w:t>
+            </w:r>
+          </w:p>
+        </w:tc>
+        <w:tc>
+          <w:tcPr>
+            <w:tcW w:type="dxa" w:w="1304"/>
+            <w:shd w:val="clear" w:color="auto" w:fill="F7EFE6"/>
+          </w:tcPr>
+          <w:p>
+            <w:r/>
+            <w:r>
+              <w:rPr>
+                <w:sz w:val="16"/>
+              </w:rPr>
+              <w:t>0</w:t>
+            </w:r>
+          </w:p>
+        </w:tc>
+        <w:tc>
+          <w:tcPr>
+            <w:tcW w:type="dxa" w:w="907"/>
+            <w:shd w:val="clear" w:color="auto" w:fill="F7EFE6"/>
+          </w:tcPr>
+          <w:p>
+            <w:r/>
+            <w:r>
+              <w:rPr>
+                <w:sz w:val="16"/>
+              </w:rPr>
+              <w:t>0</w:t>
+            </w:r>
+          </w:p>
+        </w:tc>
+      </w:tr>
+      <w:tr>
+        <w:tc>
+          <w:tcPr>
+            <w:tcW w:type="dxa" w:w="2381"/>
+          </w:tcPr>
+          <w:p>
+            <w:r/>
+            <w:r>
+              <w:rPr>
+                <w:sz w:val="16"/>
+              </w:rPr>
+              <w:t>R3 Reservorio bajo</w:t>
+            </w:r>
+          </w:p>
+        </w:tc>
+        <w:tc>
+          <w:tcPr>
+            <w:tcW w:type="dxa" w:w="1304"/>
+          </w:tcPr>
+          <w:p>
+            <w:r/>
+            <w:r>
+              <w:rPr>
+                <w:sz w:val="16"/>
+              </w:rPr>
+              <w:t>0</w:t>
+            </w:r>
+          </w:p>
+        </w:tc>
+        <w:tc>
+          <w:tcPr>
+            <w:tcW w:type="dxa" w:w="1304"/>
+          </w:tcPr>
+          <w:p>
+            <w:r/>
+            <w:r>
+              <w:rPr>
+                <w:sz w:val="16"/>
+              </w:rPr>
+              <w:t>0</w:t>
+            </w:r>
+          </w:p>
+        </w:tc>
+        <w:tc>
+          <w:tcPr>
+            <w:tcW w:type="dxa" w:w="1304"/>
+          </w:tcPr>
+          <w:p>
+            <w:r/>
+            <w:r>
+              <w:rPr>
+                <w:sz w:val="16"/>
+              </w:rPr>
+              <w:t>0</w:t>
+            </w:r>
+          </w:p>
+        </w:tc>
+        <w:tc>
+          <w:tcPr>
+            <w:tcW w:type="dxa" w:w="1304"/>
+          </w:tcPr>
+          <w:p>
+            <w:r/>
+            <w:r>
+              <w:rPr>
+                <w:sz w:val="16"/>
+              </w:rPr>
+              <w:t>0</w:t>
+            </w:r>
+          </w:p>
+        </w:tc>
+        <w:tc>
+          <w:tcPr>
+            <w:tcW w:type="dxa" w:w="907"/>
+          </w:tcPr>
+          <w:p>
+            <w:r/>
+            <w:r>
+              <w:rPr>
+                <w:sz w:val="16"/>
+              </w:rPr>
+              <w:t>0</w:t>
+            </w:r>
+          </w:p>
+        </w:tc>
+      </w:tr>
+      <w:tr>
+        <w:tc>
+          <w:tcPr>
+            <w:tcW w:type="dxa" w:w="2381"/>
+            <w:shd w:val="clear" w:color="auto" w:fill="F7EFE6"/>
+          </w:tcPr>
+          <w:p>
+            <w:r/>
+            <w:r>
+              <w:rPr>
+                <w:sz w:val="16"/>
+              </w:rPr>
+              <w:t>R4 Calidad de aire</w:t>
+            </w:r>
+          </w:p>
+        </w:tc>
+        <w:tc>
+          <w:tcPr>
+            <w:tcW w:type="dxa" w:w="1304"/>
+            <w:shd w:val="clear" w:color="auto" w:fill="F7EFE6"/>
+          </w:tcPr>
+          <w:p>
+            <w:r/>
+            <w:r>
+              <w:rPr>
+                <w:sz w:val="16"/>
+              </w:rPr>
+              <w:t>0</w:t>
+            </w:r>
+          </w:p>
+        </w:tc>
+        <w:tc>
+          <w:tcPr>
+            <w:tcW w:type="dxa" w:w="1304"/>
+            <w:shd w:val="clear" w:color="auto" w:fill="F7EFE6"/>
+          </w:tcPr>
+          <w:p>
+            <w:r/>
+            <w:r>
+              <w:rPr>
+                <w:sz w:val="16"/>
+              </w:rPr>
+              <w:t>0</w:t>
+            </w:r>
+          </w:p>
+        </w:tc>
+        <w:tc>
+          <w:tcPr>
+            <w:tcW w:type="dxa" w:w="1304"/>
+            <w:shd w:val="clear" w:color="auto" w:fill="F7EFE6"/>
+          </w:tcPr>
+          <w:p>
+            <w:r/>
+            <w:r>
+              <w:rPr>
+                <w:sz w:val="16"/>
+              </w:rPr>
+              <w:t>0</w:t>
+            </w:r>
+          </w:p>
+        </w:tc>
+        <w:tc>
+          <w:tcPr>
+            <w:tcW w:type="dxa" w:w="1304"/>
+            <w:shd w:val="clear" w:color="auto" w:fill="F7EFE6"/>
+          </w:tcPr>
+          <w:p>
+            <w:r/>
+            <w:r>
+              <w:rPr>
+                <w:sz w:val="16"/>
+              </w:rPr>
+              <w:t>0</w:t>
+            </w:r>
+          </w:p>
+        </w:tc>
+        <w:tc>
+          <w:tcPr>
+            <w:tcW w:type="dxa" w:w="907"/>
+            <w:shd w:val="clear" w:color="auto" w:fill="F7EFE6"/>
+          </w:tcPr>
+          <w:p>
+            <w:r/>
+            <w:r>
+              <w:rPr>
+                <w:sz w:val="16"/>
+              </w:rPr>
+              <w:t>0</w:t>
+            </w:r>
+          </w:p>
+        </w:tc>
+      </w:tr>
+      <w:tr>
+        <w:tc>
+          <w:tcPr>
+            <w:tcW w:type="dxa" w:w="2381"/>
+          </w:tcPr>
+          <w:p>
+            <w:r/>
+            <w:r>
+              <w:rPr>
+                <w:sz w:val="16"/>
+              </w:rPr>
+              <w:t>R7 Nodo sin reporte</w:t>
+            </w:r>
+          </w:p>
+        </w:tc>
+        <w:tc>
+          <w:tcPr>
+            <w:tcW w:type="dxa" w:w="1304"/>
+          </w:tcPr>
+          <w:p>
+            <w:r/>
+            <w:r>
+              <w:rPr>
+                <w:sz w:val="16"/>
+              </w:rPr>
+              <w:t>11</w:t>
+            </w:r>
+          </w:p>
+        </w:tc>
+        <w:tc>
+          <w:tcPr>
+            <w:tcW w:type="dxa" w:w="1304"/>
+          </w:tcPr>
+          <w:p>
+            <w:r/>
+            <w:r>
+              <w:rPr>
+                <w:sz w:val="16"/>
+              </w:rPr>
+              <w:t>14</w:t>
+            </w:r>
+          </w:p>
+        </w:tc>
+        <w:tc>
+          <w:tcPr>
+            <w:tcW w:type="dxa" w:w="1304"/>
+          </w:tcPr>
+          <w:p>
+            <w:r/>
+            <w:r>
+              <w:rPr>
+                <w:sz w:val="16"/>
+              </w:rPr>
+              <w:t>18</w:t>
+            </w:r>
+          </w:p>
+        </w:tc>
+        <w:tc>
+          <w:tcPr>
+            <w:tcW w:type="dxa" w:w="1304"/>
+          </w:tcPr>
+          <w:p>
+            <w:r/>
+            <w:r>
+              <w:rPr>
+                <w:sz w:val="16"/>
+              </w:rPr>
+              <w:t>20</w:t>
+            </w:r>
+          </w:p>
+        </w:tc>
+        <w:tc>
+          <w:tcPr>
+            <w:tcW w:type="dxa" w:w="907"/>
+          </w:tcPr>
+          <w:p>
+            <w:r/>
+            <w:r>
+              <w:rPr>
+                <w:sz w:val="16"/>
+              </w:rPr>
+              <w:t>63</w:t>
+            </w:r>
+          </w:p>
+        </w:tc>
+      </w:tr>
+    </w:tbl>
+    <w:p/>
+    <w:tbl>
+      <w:tblPr>
+        <w:tblStyle w:val="TableGrid"/>
+        <w:tblW w:type="auto" w:w="0"/>
+        <w:jc w:val="center"/>
+        <w:tblLook w:firstColumn="1" w:firstRow="1" w:lastColumn="0" w:lastRow="0" w:noHBand="0" w:noVBand="1" w:val="04A0"/>
+      </w:tblPr>
+      <w:tblGrid>
+        <w:gridCol w:w="1662"/>
+        <w:gridCol w:w="1662"/>
+        <w:gridCol w:w="1662"/>
+        <w:gridCol w:w="1662"/>
+        <w:gridCol w:w="1662"/>
+        <w:gridCol w:w="1662"/>
+      </w:tblGrid>
+      <w:tr>
+        <w:tc>
+          <w:tcPr>
+            <w:tcW w:type="dxa" w:w="1814"/>
+            <w:shd w:val="clear" w:color="auto" w:fill="6B3A1E"/>
+          </w:tcPr>
+          <w:p>
+            <w:r/>
+            <w:r>
+              <w:rPr>
+                <w:b/>
+                <w:color w:val="FFFFFF"/>
+                <w:sz w:val="15"/>
+              </w:rPr>
+              <w:t>Regla</w:t>
+            </w:r>
+          </w:p>
+        </w:tc>
+        <w:tc>
+          <w:tcPr>
+            <w:tcW w:type="dxa" w:w="1814"/>
+            <w:shd w:val="clear" w:color="auto" w:fill="6B3A1E"/>
+          </w:tcPr>
+          <w:p>
+            <w:r/>
+            <w:r>
+              <w:rPr>
+                <w:b/>
+                <w:color w:val="FFFFFF"/>
+                <w:sz w:val="15"/>
+              </w:rPr>
+              <w:t>Nodo</w:t>
+            </w:r>
+          </w:p>
+        </w:tc>
+        <w:tc>
+          <w:tcPr>
+            <w:tcW w:type="dxa" w:w="1474"/>
+            <w:shd w:val="clear" w:color="auto" w:fill="6B3A1E"/>
+          </w:tcPr>
+          <w:p>
+            <w:r/>
+            <w:r>
+              <w:rPr>
+                <w:b/>
+                <w:color w:val="FFFFFF"/>
+                <w:sz w:val="15"/>
+              </w:rPr>
+              <w:t>Inicio (local)</w:t>
+            </w:r>
+          </w:p>
+        </w:tc>
+        <w:tc>
+          <w:tcPr>
+            <w:tcW w:type="dxa" w:w="1474"/>
+            <w:shd w:val="clear" w:color="auto" w:fill="6B3A1E"/>
+          </w:tcPr>
+          <w:p>
+            <w:r/>
+            <w:r>
+              <w:rPr>
+                <w:b/>
+                <w:color w:val="FFFFFF"/>
+                <w:sz w:val="15"/>
+              </w:rPr>
+              <w:t>Fin (local)</w:t>
+            </w:r>
+          </w:p>
+        </w:tc>
+        <w:tc>
+          <w:tcPr>
+            <w:tcW w:type="dxa" w:w="1814"/>
+            <w:shd w:val="clear" w:color="auto" w:fill="6B3A1E"/>
+          </w:tcPr>
+          <w:p>
+            <w:r/>
+            <w:r>
+              <w:rPr>
+                <w:b/>
+                <w:color w:val="FFFFFF"/>
+                <w:sz w:val="15"/>
+              </w:rPr>
+              <w:t>Condición</w:t>
+            </w:r>
+          </w:p>
+        </w:tc>
+        <w:tc>
+          <w:tcPr>
+            <w:tcW w:type="dxa" w:w="794"/>
+            <w:shd w:val="clear" w:color="auto" w:fill="6B3A1E"/>
+          </w:tcPr>
+          <w:p>
+            <w:r/>
+            <w:r>
+              <w:rPr>
+                <w:b/>
+                <w:color w:val="FFFFFF"/>
+                <w:sz w:val="15"/>
+              </w:rPr>
+              <w:t>Pico</w:t>
+            </w:r>
+          </w:p>
+        </w:tc>
+      </w:tr>
+      <w:tr>
+        <w:tc>
+          <w:tcPr>
+            <w:tcW w:type="dxa" w:w="1814"/>
+          </w:tcPr>
+          <w:p>
+            <w:r/>
+            <w:r>
+              <w:rPr>
+                <w:sz w:val="15"/>
+              </w:rPr>
+              <w:t>R1 Suelo seco</w:t>
+            </w:r>
+          </w:p>
+        </w:tc>
+        <w:tc>
+          <w:tcPr>
+            <w:tcW w:type="dxa" w:w="1814"/>
+          </w:tcPr>
+          <w:p>
+            <w:r/>
+            <w:r>
+              <w:rPr>
+                <w:sz w:val="15"/>
+              </w:rPr>
+              <w:t>03-lote3-sdk</w:t>
+            </w:r>
+          </w:p>
+        </w:tc>
+        <w:tc>
+          <w:tcPr>
+            <w:tcW w:type="dxa" w:w="1474"/>
+          </w:tcPr>
+          <w:p>
+            <w:r/>
+            <w:r>
+              <w:rPr>
+                <w:sz w:val="15"/>
+              </w:rPr>
+              <w:t>25-Sep 09:00</w:t>
+            </w:r>
+          </w:p>
+        </w:tc>
+        <w:tc>
+          <w:tcPr>
+            <w:tcW w:type="dxa" w:w="1474"/>
+          </w:tcPr>
+          <w:p>
+            <w:r/>
+            <w:r>
+              <w:rPr>
+                <w:sz w:val="15"/>
+              </w:rPr>
+              <w:t>25-Sep 16:00</w:t>
+            </w:r>
+          </w:p>
+        </w:tc>
+        <w:tc>
+          <w:tcPr>
+            <w:tcW w:type="dxa" w:w="1814"/>
+          </w:tcPr>
+          <w:p>
+            <w:r/>
+            <w:r>
+              <w:rPr>
+                <w:sz w:val="15"/>
+              </w:rPr>
+              <w:t>soilMoisture &lt; 20</w:t>
+            </w:r>
+          </w:p>
+        </w:tc>
+        <w:tc>
+          <w:tcPr>
+            <w:tcW w:type="dxa" w:w="794"/>
+          </w:tcPr>
+          <w:p>
+            <w:r/>
+            <w:r>
+              <w:rPr>
+                <w:sz w:val="15"/>
+              </w:rPr>
+              <w:t>15.8</w:t>
+            </w:r>
+          </w:p>
+        </w:tc>
+      </w:tr>
+      <w:tr>
+        <w:tc>
+          <w:tcPr>
+            <w:tcW w:type="dxa" w:w="1814"/>
+            <w:shd w:val="clear" w:color="auto" w:fill="F7EFE6"/>
+          </w:tcPr>
+          <w:p>
+            <w:r/>
+            <w:r>
+              <w:rPr>
+                <w:sz w:val="15"/>
+              </w:rPr>
+              <w:t>R1 Suelo seco</w:t>
+            </w:r>
+          </w:p>
+        </w:tc>
+        <w:tc>
+          <w:tcPr>
+            <w:tcW w:type="dxa" w:w="1814"/>
+            <w:shd w:val="clear" w:color="auto" w:fill="F7EFE6"/>
+          </w:tcPr>
+          <w:p>
+            <w:r/>
+            <w:r>
+              <w:rPr>
+                <w:sz w:val="15"/>
+              </w:rPr>
+              <w:t>03-lote3-sdk</w:t>
+            </w:r>
+          </w:p>
+        </w:tc>
+        <w:tc>
+          <w:tcPr>
+            <w:tcW w:type="dxa" w:w="1474"/>
+            <w:shd w:val="clear" w:color="auto" w:fill="F7EFE6"/>
+          </w:tcPr>
+          <w:p>
+            <w:r/>
+            <w:r>
+              <w:rPr>
+                <w:sz w:val="15"/>
+              </w:rPr>
+              <w:t>25-Sep 16:15</w:t>
+            </w:r>
+          </w:p>
+        </w:tc>
+        <w:tc>
+          <w:tcPr>
+            <w:tcW w:type="dxa" w:w="1474"/>
+            <w:shd w:val="clear" w:color="auto" w:fill="F7EFE6"/>
+          </w:tcPr>
+          <w:p>
+            <w:r/>
+            <w:r>
+              <w:rPr>
+                <w:sz w:val="15"/>
+              </w:rPr>
+              <w:t>26-Sep 07:45</w:t>
+            </w:r>
+          </w:p>
+        </w:tc>
+        <w:tc>
+          <w:tcPr>
+            <w:tcW w:type="dxa" w:w="1814"/>
+            <w:shd w:val="clear" w:color="auto" w:fill="F7EFE6"/>
+          </w:tcPr>
+          <w:p>
+            <w:r/>
+            <w:r>
+              <w:rPr>
+                <w:sz w:val="15"/>
+              </w:rPr>
+              <w:t>soilMoisture &lt; 20</w:t>
+            </w:r>
+          </w:p>
+        </w:tc>
+        <w:tc>
+          <w:tcPr>
+            <w:tcW w:type="dxa" w:w="794"/>
+            <w:shd w:val="clear" w:color="auto" w:fill="F7EFE6"/>
+          </w:tcPr>
+          <w:p>
+            <w:r/>
+            <w:r>
+              <w:rPr>
+                <w:sz w:val="15"/>
+              </w:rPr>
+              <w:t>15.3</w:t>
+            </w:r>
+          </w:p>
+        </w:tc>
+      </w:tr>
+      <w:tr>
+        <w:tc>
+          <w:tcPr>
+            <w:tcW w:type="dxa" w:w="1814"/>
+          </w:tcPr>
+          <w:p>
+            <w:r/>
+            <w:r>
+              <w:rPr>
+                <w:sz w:val="15"/>
+              </w:rPr>
+              <w:t>R1 Suelo seco</w:t>
+            </w:r>
+          </w:p>
+        </w:tc>
+        <w:tc>
+          <w:tcPr>
+            <w:tcW w:type="dxa" w:w="1814"/>
+          </w:tcPr>
+          <w:p>
+            <w:r/>
+            <w:r>
+              <w:rPr>
+                <w:sz w:val="15"/>
+              </w:rPr>
+              <w:t>03-lote3-sdk</w:t>
+            </w:r>
+          </w:p>
+        </w:tc>
+        <w:tc>
+          <w:tcPr>
+            <w:tcW w:type="dxa" w:w="1474"/>
+          </w:tcPr>
+          <w:p>
+            <w:r/>
+            <w:r>
+              <w:rPr>
+                <w:sz w:val="15"/>
+              </w:rPr>
+              <w:t>26-Sep 19:15</w:t>
+            </w:r>
+          </w:p>
+        </w:tc>
+        <w:tc>
+          <w:tcPr>
+            <w:tcW w:type="dxa" w:w="1474"/>
+          </w:tcPr>
+          <w:p>
+            <w:r/>
+            <w:r>
+              <w:rPr>
+                <w:sz w:val="15"/>
+              </w:rPr>
+              <w:t>27-Sep 00:00</w:t>
+            </w:r>
+          </w:p>
+        </w:tc>
+        <w:tc>
+          <w:tcPr>
+            <w:tcW w:type="dxa" w:w="1814"/>
+          </w:tcPr>
+          <w:p>
+            <w:r/>
+            <w:r>
+              <w:rPr>
+                <w:sz w:val="15"/>
+              </w:rPr>
+              <w:t>soilMoisture &lt; 20</w:t>
+            </w:r>
+          </w:p>
+        </w:tc>
+        <w:tc>
+          <w:tcPr>
+            <w:tcW w:type="dxa" w:w="794"/>
+          </w:tcPr>
+          <w:p>
+            <w:r/>
+            <w:r>
+              <w:rPr>
+                <w:sz w:val="15"/>
+              </w:rPr>
+              <w:t>14.2</w:t>
+            </w:r>
+          </w:p>
+        </w:tc>
+      </w:tr>
+      <w:tr>
+        <w:tc>
+          <w:tcPr>
+            <w:tcW w:type="dxa" w:w="1814"/>
+            <w:shd w:val="clear" w:color="auto" w:fill="F7EFE6"/>
+          </w:tcPr>
+          <w:p>
+            <w:r/>
+            <w:r>
+              <w:rPr>
+                <w:sz w:val="15"/>
+              </w:rPr>
+              <w:t>R1 Suelo seco</w:t>
+            </w:r>
+          </w:p>
+        </w:tc>
+        <w:tc>
+          <w:tcPr>
+            <w:tcW w:type="dxa" w:w="1814"/>
+            <w:shd w:val="clear" w:color="auto" w:fill="F7EFE6"/>
+          </w:tcPr>
+          <w:p>
+            <w:r/>
+            <w:r>
+              <w:rPr>
+                <w:sz w:val="15"/>
+              </w:rPr>
+              <w:t>03-lote3-sdk</w:t>
+            </w:r>
+          </w:p>
+        </w:tc>
+        <w:tc>
+          <w:tcPr>
+            <w:tcW w:type="dxa" w:w="1474"/>
+            <w:shd w:val="clear" w:color="auto" w:fill="F7EFE6"/>
+          </w:tcPr>
+          <w:p>
+            <w:r/>
+            <w:r>
+              <w:rPr>
+                <w:sz w:val="15"/>
+              </w:rPr>
+              <w:t>27-Sep 14:45</w:t>
+            </w:r>
+          </w:p>
+        </w:tc>
+        <w:tc>
+          <w:tcPr>
+            <w:tcW w:type="dxa" w:w="1474"/>
+            <w:shd w:val="clear" w:color="auto" w:fill="F7EFE6"/>
+          </w:tcPr>
+          <w:p>
+            <w:r/>
+            <w:r>
+              <w:rPr>
+                <w:sz w:val="15"/>
+              </w:rPr>
+              <w:t>27-Sep 16:00</w:t>
+            </w:r>
+          </w:p>
+        </w:tc>
+        <w:tc>
+          <w:tcPr>
+            <w:tcW w:type="dxa" w:w="1814"/>
+            <w:shd w:val="clear" w:color="auto" w:fill="F7EFE6"/>
+          </w:tcPr>
+          <w:p>
+            <w:r/>
+            <w:r>
+              <w:rPr>
+                <w:sz w:val="15"/>
+              </w:rPr>
+              <w:t>soilMoisture &lt; 20</w:t>
+            </w:r>
+          </w:p>
+        </w:tc>
+        <w:tc>
+          <w:tcPr>
+            <w:tcW w:type="dxa" w:w="794"/>
+            <w:shd w:val="clear" w:color="auto" w:fill="F7EFE6"/>
+          </w:tcPr>
+          <w:p>
+            <w:r/>
+            <w:r>
+              <w:rPr>
+                <w:sz w:val="15"/>
+              </w:rPr>
+              <w:t>19.4</w:t>
+            </w:r>
+          </w:p>
+        </w:tc>
+      </w:tr>
+      <w:tr>
+        <w:tc>
+          <w:tcPr>
+            <w:tcW w:type="dxa" w:w="1814"/>
+          </w:tcPr>
+          <w:p>
+            <w:r/>
+            <w:r>
+              <w:rPr>
+                <w:sz w:val="15"/>
+              </w:rPr>
+              <w:t>R1 Suelo seco</w:t>
+            </w:r>
+          </w:p>
+        </w:tc>
+        <w:tc>
+          <w:tcPr>
+            <w:tcW w:type="dxa" w:w="1814"/>
+          </w:tcPr>
+          <w:p>
+            <w:r/>
+            <w:r>
+              <w:rPr>
+                <w:sz w:val="15"/>
+              </w:rPr>
+              <w:t>03-lote3-sdk</w:t>
+            </w:r>
+          </w:p>
+        </w:tc>
+        <w:tc>
+          <w:tcPr>
+            <w:tcW w:type="dxa" w:w="1474"/>
+          </w:tcPr>
+          <w:p>
+            <w:r/>
+            <w:r>
+              <w:rPr>
+                <w:sz w:val="15"/>
+              </w:rPr>
+              <w:t>27-Sep 16:15</w:t>
+            </w:r>
+          </w:p>
+        </w:tc>
+        <w:tc>
+          <w:tcPr>
+            <w:tcW w:type="dxa" w:w="1474"/>
+          </w:tcPr>
+          <w:p>
+            <w:r/>
+            <w:r>
+              <w:rPr>
+                <w:sz w:val="15"/>
+              </w:rPr>
+              <w:t>28-Sep 00:00</w:t>
+            </w:r>
+          </w:p>
+        </w:tc>
+        <w:tc>
+          <w:tcPr>
+            <w:tcW w:type="dxa" w:w="1814"/>
+          </w:tcPr>
+          <w:p>
+            <w:r/>
+            <w:r>
+              <w:rPr>
+                <w:sz w:val="15"/>
+              </w:rPr>
+              <w:t>soilMoisture &lt; 20</w:t>
+            </w:r>
+          </w:p>
+        </w:tc>
+        <w:tc>
+          <w:tcPr>
+            <w:tcW w:type="dxa" w:w="794"/>
+          </w:tcPr>
+          <w:p>
+            <w:r/>
+            <w:r>
+              <w:rPr>
+                <w:sz w:val="15"/>
+              </w:rPr>
+              <w:t>18.9</w:t>
+            </w:r>
+          </w:p>
+        </w:tc>
+      </w:tr>
+      <w:tr>
+        <w:tc>
+          <w:tcPr>
+            <w:tcW w:type="dxa" w:w="1814"/>
+            <w:shd w:val="clear" w:color="auto" w:fill="F7EFE6"/>
+          </w:tcPr>
+          <w:p>
+            <w:r/>
+            <w:r>
+              <w:rPr>
+                <w:sz w:val="15"/>
+              </w:rPr>
+              <w:t>R1 Suelo seco</w:t>
+            </w:r>
+          </w:p>
+        </w:tc>
+        <w:tc>
+          <w:tcPr>
+            <w:tcW w:type="dxa" w:w="1814"/>
+            <w:shd w:val="clear" w:color="auto" w:fill="F7EFE6"/>
+          </w:tcPr>
+          <w:p>
+            <w:r/>
+            <w:r>
+              <w:rPr>
+                <w:sz w:val="15"/>
+              </w:rPr>
+              <w:t>03-lote3-sdk</w:t>
+            </w:r>
+          </w:p>
+        </w:tc>
+        <w:tc>
+          <w:tcPr>
+            <w:tcW w:type="dxa" w:w="1474"/>
+            <w:shd w:val="clear" w:color="auto" w:fill="F7EFE6"/>
+          </w:tcPr>
+          <w:p>
+            <w:r/>
+            <w:r>
+              <w:rPr>
+                <w:sz w:val="15"/>
+              </w:rPr>
+              <w:t>28-Sep 13:00</w:t>
+            </w:r>
+          </w:p>
+        </w:tc>
+        <w:tc>
+          <w:tcPr>
+            <w:tcW w:type="dxa" w:w="1474"/>
+            <w:shd w:val="clear" w:color="auto" w:fill="F7EFE6"/>
+          </w:tcPr>
+          <w:p>
+            <w:r/>
+            <w:r>
+              <w:rPr>
+                <w:sz w:val="15"/>
+              </w:rPr>
+              <w:t>28-Sep 23:45</w:t>
+            </w:r>
+          </w:p>
+        </w:tc>
+        <w:tc>
+          <w:tcPr>
+            <w:tcW w:type="dxa" w:w="1814"/>
+            <w:shd w:val="clear" w:color="auto" w:fill="F7EFE6"/>
+          </w:tcPr>
+          <w:p>
+            <w:r/>
+            <w:r>
+              <w:rPr>
+                <w:sz w:val="15"/>
+              </w:rPr>
+              <w:t>soilMoisture &lt; 20</w:t>
+            </w:r>
+          </w:p>
+        </w:tc>
+        <w:tc>
+          <w:tcPr>
+            <w:tcW w:type="dxa" w:w="794"/>
+            <w:shd w:val="clear" w:color="auto" w:fill="F7EFE6"/>
+          </w:tcPr>
+          <w:p>
+            <w:r/>
+            <w:r>
+              <w:rPr>
+                <w:sz w:val="15"/>
+              </w:rPr>
+              <w:t>17.7</w:t>
+            </w:r>
+          </w:p>
+        </w:tc>
+      </w:tr>
+    </w:tbl>
+    <w:p/>
+    <w:p>
+      <w:r>
+        <w:rPr>
+          <w:b w:val="0"/>
+          <w:sz w:val="18"/>
+        </w:rPr>
+        <w:t>Lectura: R1 se activa en el Lote 3, cuyo modelo de suelo pierde humedad cada día hasta que el operador envía setIrrigation (demostrado en la sección 5). R7 registra las desconexiones de la sección 7 — cortes programados, la caída del gateway del 26/09 y los periodos con el equipo de los Wokwi apagado — por nodo: 01-lote1-twin (1), 02-lote2-wokwi (12), 03-lote3-sdk (6), 04-aire-cams (3), 05-meteo-feed (3), 06-ferm-paho (5), 07-campo-era5 (3), 08-dosel-rest (5), 09-riego-wokwi (20), 10-bodega-mqttjs (5). R2 Fermentacion alta, R3 Reservorio bajo, R4 Calidad de aire no se dispararon: los valores reales quedaron dentro del rango operativo (AQI máx. 73, fermentación máx. 51.0 °C, reservorio mín. 66 %).</w:t>
+      </w:r>
+    </w:p>
     <w:p>
       <w:pPr>
         <w:pStyle w:val="Heading1"/>
@@ -16954,7 +18302,7 @@
         <w:drawing>
           <wp:inline xmlns:a="http://schemas.openxmlformats.org/drawingml/2006/main" xmlns:pic="http://schemas.openxmlformats.org/drawingml/2006/picture">
             <wp:extent cx="4320000" cy="4549500"/>
-            <wp:docPr id="19" name="Picture 19"/>
+            <wp:docPr id="21" name="Picture 21"/>
             <wp:cNvGraphicFramePr>
               <a:graphicFrameLocks noChangeAspect="1"/>
             </wp:cNvGraphicFramePr>
@@ -16966,7 +18314,7 @@
                     <pic:cNvPicPr/>
                   </pic:nvPicPr>
                   <pic:blipFill>
-                    <a:blip r:embed="rId29"/>
+                    <a:blip r:embed="rId31"/>
                     <a:stretch>
                       <a:fillRect/>
                     </a:stretch>
@@ -17006,7 +18354,7 @@
         <w:drawing>
           <wp:inline xmlns:a="http://schemas.openxmlformats.org/drawingml/2006/main" xmlns:pic="http://schemas.openxmlformats.org/drawingml/2006/picture">
             <wp:extent cx="4320000" cy="4549500"/>
-            <wp:docPr id="20" name="Picture 20"/>
+            <wp:docPr id="22" name="Picture 22"/>
             <wp:cNvGraphicFramePr>
               <a:graphicFrameLocks noChangeAspect="1"/>
             </wp:cNvGraphicFramePr>
@@ -17018,7 +18366,7 @@
                     <pic:cNvPicPr/>
                   </pic:nvPicPr>
                   <pic:blipFill>
-                    <a:blip r:embed="rId30"/>
+                    <a:blip r:embed="rId32"/>
                     <a:stretch>
                       <a:fillRect/>
                     </a:stretch>
@@ -17048,6 +18396,110 @@
           <w:sz w:val="17"/>
         </w:rPr>
         <w:t>Figura. Wokwi ESP32 #2 (Reservorio): monitor serie y respuesta al comando setPump.</w:t>
+      </w:r>
+    </w:p>
+    <w:p>
+      <w:pPr>
+        <w:jc w:val="center"/>
+      </w:pPr>
+      <w:r>
+        <w:drawing>
+          <wp:inline xmlns:a="http://schemas.openxmlformats.org/drawingml/2006/main" xmlns:pic="http://schemas.openxmlformats.org/drawingml/2006/picture">
+            <wp:extent cx="5940000" cy="2925914"/>
+            <wp:docPr id="23" name="Picture 23"/>
+            <wp:cNvGraphicFramePr>
+              <a:graphicFrameLocks noChangeAspect="1"/>
+            </wp:cNvGraphicFramePr>
+            <a:graphic>
+              <a:graphicData uri="http://schemas.openxmlformats.org/drawingml/2006/picture">
+                <pic:pic>
+                  <pic:nvPicPr>
+                    <pic:cNvPr id="0" name="12-lote2-conectado-central.png"/>
+                    <pic:cNvPicPr/>
+                  </pic:nvPicPr>
+                  <pic:blipFill>
+                    <a:blip r:embed="rId33"/>
+                    <a:stretch>
+                      <a:fillRect/>
+                    </a:stretch>
+                  </pic:blipFill>
+                  <pic:spPr>
+                    <a:xfrm>
+                      <a:off x="0" y="0"/>
+                      <a:ext cx="5940000" cy="2925914"/>
+                    </a:xfrm>
+                    <a:prstGeom prst="rect"/>
+                  </pic:spPr>
+                </pic:pic>
+              </a:graphicData>
+            </a:graphic>
+          </wp:inline>
+        </w:drawing>
+      </w:r>
+    </w:p>
+    <w:p>
+      <w:pPr>
+        <w:jc w:val="center"/>
+      </w:pPr>
+      <w:r>
+        <w:rPr>
+          <w:i/>
+          <w:color w:val="555555"/>
+          <w:sz w:val="17"/>
+        </w:rPr>
+        <w:t>Figura. Nodo Wokwi Conectado en IoT Central con telemetría en vivo.</w:t>
+      </w:r>
+    </w:p>
+    <w:p>
+      <w:pPr>
+        <w:jc w:val="center"/>
+      </w:pPr>
+      <w:r>
+        <w:drawing>
+          <wp:inline xmlns:a="http://schemas.openxmlformats.org/drawingml/2006/main" xmlns:pic="http://schemas.openxmlformats.org/drawingml/2006/picture">
+            <wp:extent cx="5400000" cy="4083731"/>
+            <wp:docPr id="24" name="Picture 24"/>
+            <wp:cNvGraphicFramePr>
+              <a:graphicFrameLocks noChangeAspect="1"/>
+            </wp:cNvGraphicFramePr>
+            <a:graphic>
+              <a:graphicData uri="http://schemas.openxmlformats.org/drawingml/2006/picture">
+                <pic:pic>
+                  <pic:nvPicPr>
+                    <pic:cNvPr id="0" name="14-vscode-serial-riego.png"/>
+                    <pic:cNvPicPr/>
+                  </pic:nvPicPr>
+                  <pic:blipFill>
+                    <a:blip r:embed="rId34"/>
+                    <a:stretch>
+                      <a:fillRect/>
+                    </a:stretch>
+                  </pic:blipFill>
+                  <pic:spPr>
+                    <a:xfrm>
+                      <a:off x="0" y="0"/>
+                      <a:ext cx="5400000" cy="4083731"/>
+                    </a:xfrm>
+                    <a:prstGeom prst="rect"/>
+                  </pic:spPr>
+                </pic:pic>
+              </a:graphicData>
+            </a:graphic>
+          </wp:inline>
+        </w:drawing>
+      </w:r>
+    </w:p>
+    <w:p>
+      <w:pPr>
+        <w:jc w:val="center"/>
+      </w:pPr>
+      <w:r>
+        <w:rPr>
+          <w:i/>
+          <w:color w:val="555555"/>
+          <w:sz w:val="17"/>
+        </w:rPr>
+        <w:t>Figura. Wokwi for VS Code (nodo 09): monitor serie con TX periódicos y ciclos HUB DISCONNECTED → Connecting → CONNECTED.</w:t>
       </w:r>
     </w:p>
     <w:p>

</xml_diff>

<commit_message>
Tabla de parametros: encabezado 'Valor en el codigo (min/max/offset)' como pide el enunciado
Co-Authored-By: Claude Opus 5.5 <noreply@anthropic.com>
</commit_message>
<xml_diff>
--- a/Informe_Parcial1_CacaoSense.docx
+++ b/Informe_Parcial1_CacaoSense.docx
@@ -321,7 +321,7 @@
               <w:rPr>
                 <w:sz w:val="18"/>
               </w:rPr>
-              <w:t>1.0 · generado 28/09/2026 23:37 (hora Colombia)</w:t>
+              <w:t>1.0 · generado 29/09/2026 00:19 (hora Colombia)</w:t>
             </w:r>
           </w:p>
         </w:tc>
@@ -749,7 +749,7 @@
               <w:rPr>
                 <w:sz w:val="17"/>
               </w:rPr>
-              <w:t>28/09/2026</w:t>
+              <w:t>29/09/2026</w:t>
             </w:r>
           </w:p>
         </w:tc>
@@ -3566,7 +3566,7 @@
                 <w:color w:val="FFFFFF"/>
                 <w:sz w:val="13"/>
               </w:rPr>
-              <w:t>Valor en el código</w:t>
+              <w:t>Valor en el código (mín/máx/offset)</w:t>
             </w:r>
           </w:p>
         </w:tc>

</xml_diff>

<commit_message>
Portada sin la fila 'Version del documento'
Co-Authored-By: Claude Opus 5.5 <noreply@anthropic.com>
</commit_message>
<xml_diff>
--- a/Informe_Parcial1_CacaoSense.docx
+++ b/Informe_Parcial1_CacaoSense.docx
@@ -290,38 +290,6 @@
                 <w:sz w:val="18"/>
               </w:rPr>
               <w:t>4 fechas reales: Vie 25-sep, Sab 26-sep, Dom 27-sep, Lun 28-sep de 2026</w:t>
-            </w:r>
-          </w:p>
-        </w:tc>
-      </w:tr>
-      <w:tr>
-        <w:tc>
-          <w:tcPr>
-            <w:tcW w:type="dxa" w:w="2551"/>
-            <w:shd w:val="clear" w:color="auto" w:fill="F7EFE6"/>
-          </w:tcPr>
-          <w:p>
-            <w:r/>
-            <w:r>
-              <w:rPr>
-                <w:sz w:val="18"/>
-              </w:rPr>
-              <w:t>Versión del documento</w:t>
-            </w:r>
-          </w:p>
-        </w:tc>
-        <w:tc>
-          <w:tcPr>
-            <w:tcW w:type="dxa" w:w="7087"/>
-            <w:shd w:val="clear" w:color="auto" w:fill="F7EFE6"/>
-          </w:tcPr>
-          <w:p>
-            <w:r/>
-            <w:r>
-              <w:rPr>
-                <w:sz w:val="18"/>
-              </w:rPr>
-              <w:t>1.0 · generado 29/09/2026 00:19 (hora Colombia)</w:t>
             </w:r>
           </w:p>
         </w:tc>

</xml_diff>